<commit_message>
Added changes and updation to the documentation
</commit_message>
<xml_diff>
--- a/Documentation/Ideation Phase(1)/Empathy Map Canvas.docx
+++ b/Documentation/Ideation Phase(1)/Empathy Map Canvas.docx
@@ -1,27 +1,26 @@
 
 <file path=word/document.xml><?xml version="1.0" encoding="utf-8"?>
-<w:document xmlns:mc="http://schemas.openxmlformats.org/markup-compatibility/2006" xmlns:o="urn:schemas-microsoft-com:office:office" xmlns:r="http://schemas.openxmlformats.org/officeDocument/2006/relationships" xmlns:m="http://schemas.openxmlformats.org/officeDocument/2006/math" xmlns:v="urn:schemas-microsoft-com:vml" xmlns:wp="http://schemas.openxmlformats.org/drawingml/2006/wordprocessingDrawing" xmlns:w10="urn:schemas-microsoft-com:office:word" xmlns:w="http://schemas.openxmlformats.org/wordprocessingml/2006/main" xmlns:wne="http://schemas.microsoft.com/office/word/2006/wordml" xmlns:sl="http://schemas.openxmlformats.org/schemaLibrary/2006/main" xmlns:a="http://schemas.openxmlformats.org/drawingml/2006/main" xmlns:pic="http://schemas.openxmlformats.org/drawingml/2006/picture" xmlns:c="http://schemas.openxmlformats.org/drawingml/2006/chart" xmlns:lc="http://schemas.openxmlformats.org/drawingml/2006/lockedCanvas" xmlns:dgm="http://schemas.openxmlformats.org/drawingml/2006/diagram" xmlns:wps="http://schemas.microsoft.com/office/word/2010/wordprocessingShape" xmlns:wpg="http://schemas.microsoft.com/office/word/2010/wordprocessingGroup" xmlns:w14="http://schemas.microsoft.com/office/word/2010/wordml" xmlns:w15="http://schemas.microsoft.com/office/word/2012/wordml" xmlns:w16="http://schemas.microsoft.com/office/word/2018/wordml" xmlns:w16cex="http://schemas.microsoft.com/office/word/2018/wordml/cex" xmlns:w16cid="http://schemas.microsoft.com/office/word/2016/wordml/cid" xmlns="http://schemas.microsoft.com/office/tasks/2019/documenttasks" xmlns:cr="http://schemas.microsoft.com/office/comments/2020/reactions">
+<w:document xmlns:wpc="http://schemas.microsoft.com/office/word/2010/wordprocessingCanvas" xmlns:cx="http://schemas.microsoft.com/office/drawing/2014/chartex" xmlns:cx1="http://schemas.microsoft.com/office/drawing/2015/9/8/chartex" xmlns:cx2="http://schemas.microsoft.com/office/drawing/2015/10/21/chartex" xmlns:cx3="http://schemas.microsoft.com/office/drawing/2016/5/9/chartex" xmlns:cx4="http://schemas.microsoft.com/office/drawing/2016/5/10/chartex" xmlns:cx5="http://schemas.microsoft.com/office/drawing/2016/5/11/chartex" xmlns:cx6="http://schemas.microsoft.com/office/drawing/2016/5/12/chartex" xmlns:cx7="http://schemas.microsoft.com/office/drawing/2016/5/13/chartex" xmlns:cx8="http://schemas.microsoft.com/office/drawing/2016/5/14/chartex" xmlns:mc="http://schemas.openxmlformats.org/markup-compatibility/2006" xmlns:aink="http://schemas.microsoft.com/office/drawing/2016/ink" xmlns:am3d="http://schemas.microsoft.com/office/drawing/2017/model3d" xmlns:o="urn:schemas-microsoft-com:office:office" xmlns:oel="http://schemas.microsoft.com/office/2019/extlst" xmlns:r="http://schemas.openxmlformats.org/officeDocument/2006/relationships" xmlns:m="http://schemas.openxmlformats.org/officeDocument/2006/math" xmlns:v="urn:schemas-microsoft-com:vml" xmlns:wp14="http://schemas.microsoft.com/office/word/2010/wordprocessingDrawing" xmlns:wp="http://schemas.openxmlformats.org/drawingml/2006/wordprocessingDrawing" xmlns:w10="urn:schemas-microsoft-com:office:word" xmlns:w="http://schemas.openxmlformats.org/wordprocessingml/2006/main" xmlns:w14="http://schemas.microsoft.com/office/word/2010/wordml" xmlns:w15="http://schemas.microsoft.com/office/word/2012/wordml" xmlns:w16cex="http://schemas.microsoft.com/office/word/2018/wordml/cex" xmlns:w16cid="http://schemas.microsoft.com/office/word/2016/wordml/cid" xmlns:w16="http://schemas.microsoft.com/office/word/2018/wordml" xmlns:w16du="http://schemas.microsoft.com/office/word/2023/wordml/word16du" xmlns:w16sdtdh="http://schemas.microsoft.com/office/word/2020/wordml/sdtdatahash" xmlns:w16sdtfl="http://schemas.microsoft.com/office/word/2024/wordml/sdtformatlock" xmlns:w16se="http://schemas.microsoft.com/office/word/2015/wordml/symex" xmlns:wpg="http://schemas.microsoft.com/office/word/2010/wordprocessingGroup" xmlns:wpi="http://schemas.microsoft.com/office/word/2010/wordprocessingInk" xmlns:wne="http://schemas.microsoft.com/office/word/2006/wordml" xmlns:wps="http://schemas.microsoft.com/office/word/2010/wordprocessingShape" mc:Ignorable="w14 w15 w16se w16cid w16 w16cex w16sdtdh w16sdtfl w16du wp14">
   <w:body>
     <w:p>
       <w:pPr>
         <w:spacing w:line="259" w:lineRule="auto"/>
         <w:jc w:val="center"/>
         <w:rPr>
-          <w:rFonts w:ascii="Calibri" w:cs="Calibri" w:eastAsia="Calibri" w:hAnsi="Calibri"/>
-          <w:b w:val="1"/>
+          <w:rFonts w:ascii="Calibri" w:eastAsia="Calibri" w:hAnsi="Calibri" w:cs="Calibri"/>
+          <w:b/>
           <w:sz w:val="28"/>
           <w:szCs w:val="28"/>
         </w:rPr>
       </w:pPr>
       <w:r>
         <w:rPr>
-          <w:rFonts w:ascii="Calibri" w:cs="Calibri" w:eastAsia="Calibri" w:hAnsi="Calibri"/>
-          <w:b w:val="1"/>
+          <w:rFonts w:ascii="Calibri" w:eastAsia="Calibri" w:hAnsi="Calibri" w:cs="Calibri"/>
+          <w:b/>
           <w:sz w:val="28"/>
           <w:szCs w:val="28"/>
-          <w:rtl w:val="0"/>
-        </w:rPr>
-        <w:t xml:space="preserve">Ideation Phase</w:t>
+        </w:rPr>
+        <w:t>Ideation Phase</w:t>
       </w:r>
     </w:p>
     <w:p>
@@ -29,21 +28,20 @@
         <w:spacing w:line="259" w:lineRule="auto"/>
         <w:jc w:val="center"/>
         <w:rPr>
-          <w:rFonts w:ascii="Calibri" w:cs="Calibri" w:eastAsia="Calibri" w:hAnsi="Calibri"/>
-          <w:b w:val="1"/>
+          <w:rFonts w:ascii="Calibri" w:eastAsia="Calibri" w:hAnsi="Calibri" w:cs="Calibri"/>
+          <w:b/>
           <w:sz w:val="28"/>
           <w:szCs w:val="28"/>
         </w:rPr>
       </w:pPr>
       <w:r>
         <w:rPr>
-          <w:rFonts w:ascii="Calibri" w:cs="Calibri" w:eastAsia="Calibri" w:hAnsi="Calibri"/>
-          <w:b w:val="1"/>
+          <w:rFonts w:ascii="Calibri" w:eastAsia="Calibri" w:hAnsi="Calibri" w:cs="Calibri"/>
+          <w:b/>
           <w:sz w:val="28"/>
           <w:szCs w:val="28"/>
-          <w:rtl w:val="0"/>
-        </w:rPr>
-        <w:t xml:space="preserve">Empathize &amp; Discover</w:t>
+        </w:rPr>
+        <w:t>Empathize &amp; Discover</w:t>
       </w:r>
     </w:p>
     <w:p>
@@ -51,198 +49,194 @@
         <w:spacing w:line="259" w:lineRule="auto"/>
         <w:jc w:val="center"/>
         <w:rPr>
-          <w:rFonts w:ascii="Calibri" w:cs="Calibri" w:eastAsia="Calibri" w:hAnsi="Calibri"/>
-          <w:b w:val="1"/>
+          <w:rFonts w:ascii="Calibri" w:eastAsia="Calibri" w:hAnsi="Calibri" w:cs="Calibri"/>
+          <w:b/>
           <w:sz w:val="28"/>
           <w:szCs w:val="28"/>
         </w:rPr>
       </w:pPr>
-      <w:r>
-        <w:rPr>
-          <w:rtl w:val="0"/>
-        </w:rPr>
-      </w:r>
     </w:p>
     <w:tbl>
       <w:tblPr>
-        <w:tblStyle w:val="Table1"/>
-        <w:tblW w:w="9016.0" w:type="dxa"/>
-        <w:jc w:val="left"/>
+        <w:tblStyle w:val="a0"/>
+        <w:tblW w:w="9016" w:type="dxa"/>
         <w:tblBorders>
-          <w:top w:color="000000" w:space="0" w:sz="4" w:val="single"/>
-          <w:left w:color="000000" w:space="0" w:sz="4" w:val="single"/>
-          <w:bottom w:color="000000" w:space="0" w:sz="4" w:val="single"/>
-          <w:right w:color="000000" w:space="0" w:sz="4" w:val="single"/>
-          <w:insideH w:color="000000" w:space="0" w:sz="4" w:val="single"/>
-          <w:insideV w:color="000000" w:space="0" w:sz="4" w:val="single"/>
+          <w:top w:val="single" w:sz="4" w:space="0" w:color="000000"/>
+          <w:left w:val="single" w:sz="4" w:space="0" w:color="000000"/>
+          <w:bottom w:val="single" w:sz="4" w:space="0" w:color="000000"/>
+          <w:right w:val="single" w:sz="4" w:space="0" w:color="000000"/>
+          <w:insideH w:val="single" w:sz="4" w:space="0" w:color="000000"/>
+          <w:insideV w:val="single" w:sz="4" w:space="0" w:color="000000"/>
         </w:tblBorders>
         <w:tblLayout w:type="fixed"/>
-        <w:tblLook w:val="0400"/>
+        <w:tblLook w:val="0400" w:firstRow="0" w:lastRow="0" w:firstColumn="0" w:lastColumn="0" w:noHBand="0" w:noVBand="1"/>
       </w:tblPr>
       <w:tblGrid>
         <w:gridCol w:w="4508"/>
         <w:gridCol w:w="4508"/>
-        <w:tblGridChange w:id="0">
-          <w:tblGrid>
-            <w:gridCol w:w="4508"/>
-            <w:gridCol w:w="4508"/>
-          </w:tblGrid>
-        </w:tblGridChange>
       </w:tblGrid>
       <w:tr>
-        <w:trPr>
-          <w:cantSplit w:val="0"/>
-          <w:tblHeader w:val="0"/>
-        </w:trPr>
         <w:tc>
-          <w:tcPr/>
+          <w:tcPr>
+            <w:tcW w:w="4508" w:type="dxa"/>
+          </w:tcPr>
           <w:p>
             <w:pPr>
               <w:rPr>
-                <w:rFonts w:ascii="Calibri" w:cs="Calibri" w:eastAsia="Calibri" w:hAnsi="Calibri"/>
+                <w:rFonts w:ascii="Calibri" w:eastAsia="Calibri" w:hAnsi="Calibri" w:cs="Calibri"/>
               </w:rPr>
             </w:pPr>
             <w:r>
               <w:rPr>
-                <w:rFonts w:ascii="Calibri" w:cs="Calibri" w:eastAsia="Calibri" w:hAnsi="Calibri"/>
-                <w:rtl w:val="0"/>
-              </w:rPr>
-              <w:t xml:space="preserve">Date</w:t>
+                <w:rFonts w:ascii="Calibri" w:eastAsia="Calibri" w:hAnsi="Calibri" w:cs="Calibri"/>
+              </w:rPr>
+              <w:t>Date</w:t>
             </w:r>
           </w:p>
         </w:tc>
         <w:tc>
-          <w:tcPr/>
+          <w:tcPr>
+            <w:tcW w:w="4508" w:type="dxa"/>
+          </w:tcPr>
           <w:p>
             <w:pPr>
               <w:rPr>
-                <w:rFonts w:ascii="Calibri" w:cs="Calibri" w:eastAsia="Calibri" w:hAnsi="Calibri"/>
+                <w:rFonts w:ascii="Calibri" w:eastAsia="Calibri" w:hAnsi="Calibri" w:cs="Calibri"/>
               </w:rPr>
             </w:pPr>
             <w:r>
               <w:rPr>
-                <w:rFonts w:ascii="Calibri" w:cs="Calibri" w:eastAsia="Calibri" w:hAnsi="Calibri"/>
-                <w:rtl w:val="0"/>
-              </w:rPr>
-              <w:t xml:space="preserve">31 January 2025</w:t>
+                <w:rFonts w:ascii="Calibri" w:eastAsia="Calibri" w:hAnsi="Calibri" w:cs="Calibri"/>
+              </w:rPr>
+              <w:t>7</w:t>
+            </w:r>
+            <w:r>
+              <w:rPr>
+                <w:rFonts w:ascii="Calibri" w:eastAsia="Calibri" w:hAnsi="Calibri" w:cs="Calibri"/>
+              </w:rPr>
+              <w:t>-12-</w:t>
+            </w:r>
+            <w:r>
+              <w:rPr>
+                <w:rFonts w:ascii="Calibri" w:eastAsia="Calibri" w:hAnsi="Calibri" w:cs="Calibri"/>
+              </w:rPr>
+              <w:t>2025</w:t>
             </w:r>
           </w:p>
         </w:tc>
       </w:tr>
       <w:tr>
-        <w:trPr>
-          <w:cantSplit w:val="0"/>
-          <w:tblHeader w:val="0"/>
-        </w:trPr>
         <w:tc>
-          <w:tcPr/>
+          <w:tcPr>
+            <w:tcW w:w="4508" w:type="dxa"/>
+          </w:tcPr>
           <w:p>
             <w:pPr>
               <w:rPr>
-                <w:rFonts w:ascii="Calibri" w:cs="Calibri" w:eastAsia="Calibri" w:hAnsi="Calibri"/>
+                <w:rFonts w:ascii="Calibri" w:eastAsia="Calibri" w:hAnsi="Calibri" w:cs="Calibri"/>
               </w:rPr>
             </w:pPr>
             <w:r>
               <w:rPr>
-                <w:rFonts w:ascii="Calibri" w:cs="Calibri" w:eastAsia="Calibri" w:hAnsi="Calibri"/>
-                <w:rtl w:val="0"/>
-              </w:rPr>
-              <w:t xml:space="preserve">Team ID</w:t>
+                <w:rFonts w:ascii="Calibri" w:eastAsia="Calibri" w:hAnsi="Calibri" w:cs="Calibri"/>
+              </w:rPr>
+              <w:t>Team ID</w:t>
             </w:r>
           </w:p>
         </w:tc>
         <w:tc>
-          <w:tcPr/>
+          <w:tcPr>
+            <w:tcW w:w="4508" w:type="dxa"/>
+          </w:tcPr>
           <w:p>
             <w:pPr>
               <w:rPr>
-                <w:rFonts w:ascii="Calibri" w:cs="Calibri" w:eastAsia="Calibri" w:hAnsi="Calibri"/>
+                <w:rFonts w:ascii="Calibri" w:eastAsia="Calibri" w:hAnsi="Calibri" w:cs="Calibri"/>
               </w:rPr>
             </w:pPr>
             <w:r>
               <w:rPr>
-                <w:rtl w:val="0"/>
-              </w:rPr>
+                <w:rFonts w:ascii="Calibri" w:eastAsia="Calibri" w:hAnsi="Calibri" w:cs="Calibri"/>
+                <w:b/>
+                <w:bCs/>
+              </w:rPr>
+              <w:t>SWUID20250207937</w:t>
             </w:r>
           </w:p>
         </w:tc>
       </w:tr>
       <w:tr>
-        <w:trPr>
-          <w:cantSplit w:val="0"/>
-          <w:tblHeader w:val="0"/>
-        </w:trPr>
         <w:tc>
-          <w:tcPr/>
+          <w:tcPr>
+            <w:tcW w:w="4508" w:type="dxa"/>
+          </w:tcPr>
           <w:p>
             <w:pPr>
               <w:rPr>
-                <w:rFonts w:ascii="Calibri" w:cs="Calibri" w:eastAsia="Calibri" w:hAnsi="Calibri"/>
+                <w:rFonts w:ascii="Calibri" w:eastAsia="Calibri" w:hAnsi="Calibri" w:cs="Calibri"/>
               </w:rPr>
             </w:pPr>
             <w:r>
               <w:rPr>
-                <w:rFonts w:ascii="Calibri" w:cs="Calibri" w:eastAsia="Calibri" w:hAnsi="Calibri"/>
-                <w:rtl w:val="0"/>
-              </w:rPr>
-              <w:t xml:space="preserve">Project Name</w:t>
+                <w:rFonts w:ascii="Calibri" w:eastAsia="Calibri" w:hAnsi="Calibri" w:cs="Calibri"/>
+              </w:rPr>
+              <w:t>Project Name</w:t>
             </w:r>
           </w:p>
         </w:tc>
         <w:tc>
-          <w:tcPr/>
+          <w:tcPr>
+            <w:tcW w:w="4508" w:type="dxa"/>
+          </w:tcPr>
           <w:p>
             <w:pPr>
               <w:rPr>
-                <w:rFonts w:ascii="Calibri" w:cs="Calibri" w:eastAsia="Calibri" w:hAnsi="Calibri"/>
+                <w:rFonts w:ascii="Calibri" w:eastAsia="Calibri" w:hAnsi="Calibri" w:cs="Calibri"/>
               </w:rPr>
             </w:pPr>
             <w:r>
               <w:rPr>
-                <w:rFonts w:ascii="Calibri" w:cs="Calibri" w:eastAsia="Calibri" w:hAnsi="Calibri"/>
-                <w:rtl w:val="0"/>
-              </w:rPr>
-              <w:t xml:space="preserve">Freelance Finder</w:t>
+                <w:rFonts w:ascii="Calibri" w:eastAsia="Calibri" w:hAnsi="Calibri" w:cs="Calibri"/>
+              </w:rPr>
+              <w:t>Social Media App (MERN)</w:t>
             </w:r>
           </w:p>
         </w:tc>
       </w:tr>
       <w:tr>
-        <w:trPr>
-          <w:cantSplit w:val="0"/>
-          <w:tblHeader w:val="0"/>
-        </w:trPr>
         <w:tc>
-          <w:tcPr/>
+          <w:tcPr>
+            <w:tcW w:w="4508" w:type="dxa"/>
+          </w:tcPr>
           <w:p>
             <w:pPr>
               <w:rPr>
-                <w:rFonts w:ascii="Calibri" w:cs="Calibri" w:eastAsia="Calibri" w:hAnsi="Calibri"/>
+                <w:rFonts w:ascii="Calibri" w:eastAsia="Calibri" w:hAnsi="Calibri" w:cs="Calibri"/>
               </w:rPr>
             </w:pPr>
             <w:r>
               <w:rPr>
-                <w:rFonts w:ascii="Calibri" w:cs="Calibri" w:eastAsia="Calibri" w:hAnsi="Calibri"/>
-                <w:rtl w:val="0"/>
-              </w:rPr>
-              <w:t xml:space="preserve">Maximum Marks</w:t>
+                <w:rFonts w:ascii="Calibri" w:eastAsia="Calibri" w:hAnsi="Calibri" w:cs="Calibri"/>
+              </w:rPr>
+              <w:t>Maximum Marks</w:t>
             </w:r>
           </w:p>
         </w:tc>
         <w:tc>
-          <w:tcPr/>
+          <w:tcPr>
+            <w:tcW w:w="4508" w:type="dxa"/>
+          </w:tcPr>
           <w:p>
             <w:pPr>
               <w:rPr>
-                <w:rFonts w:ascii="Calibri" w:cs="Calibri" w:eastAsia="Calibri" w:hAnsi="Calibri"/>
+                <w:rFonts w:ascii="Calibri" w:eastAsia="Calibri" w:hAnsi="Calibri" w:cs="Calibri"/>
               </w:rPr>
             </w:pPr>
             <w:r>
               <w:rPr>
-                <w:rFonts w:ascii="Calibri" w:cs="Calibri" w:eastAsia="Calibri" w:hAnsi="Calibri"/>
-                <w:rtl w:val="0"/>
-              </w:rPr>
-              <w:t xml:space="preserve">4 Marks</w:t>
+                <w:rFonts w:ascii="Calibri" w:eastAsia="Calibri" w:hAnsi="Calibri" w:cs="Calibri"/>
+              </w:rPr>
+              <w:t>4 Marks</w:t>
             </w:r>
           </w:p>
         </w:tc>
@@ -252,79 +246,125 @@
       <w:pPr>
         <w:spacing w:after="160" w:line="259" w:lineRule="auto"/>
         <w:rPr>
-          <w:rFonts w:ascii="Calibri" w:cs="Calibri" w:eastAsia="Calibri" w:hAnsi="Calibri"/>
-          <w:b w:val="1"/>
+          <w:rFonts w:ascii="Calibri" w:eastAsia="Calibri" w:hAnsi="Calibri" w:cs="Calibri"/>
+          <w:b/>
           <w:sz w:val="24"/>
           <w:szCs w:val="24"/>
         </w:rPr>
       </w:pPr>
-      <w:r>
-        <w:rPr>
-          <w:rtl w:val="0"/>
-        </w:rPr>
-      </w:r>
     </w:p>
     <w:p>
       <w:pPr>
         <w:spacing w:after="160" w:line="259" w:lineRule="auto"/>
         <w:rPr>
-          <w:rFonts w:ascii="Calibri" w:cs="Calibri" w:eastAsia="Calibri" w:hAnsi="Calibri"/>
-          <w:b w:val="1"/>
+          <w:rFonts w:ascii="Calibri" w:eastAsia="Calibri" w:hAnsi="Calibri" w:cs="Calibri"/>
+          <w:b/>
           <w:sz w:val="24"/>
           <w:szCs w:val="24"/>
         </w:rPr>
       </w:pPr>
       <w:r>
         <w:rPr>
-          <w:rFonts w:ascii="Calibri" w:cs="Calibri" w:eastAsia="Calibri" w:hAnsi="Calibri"/>
-          <w:b w:val="1"/>
-          <w:sz w:val="24"/>
-          <w:szCs w:val="24"/>
-          <w:rtl w:val="0"/>
-        </w:rPr>
-        <w:t xml:space="preserve">Empathy Map Canvas:</w:t>
+          <w:rFonts w:ascii="Calibri" w:eastAsia="Calibri" w:hAnsi="Calibri" w:cs="Calibri"/>
+          <w:b/>
+          <w:sz w:val="24"/>
+          <w:szCs w:val="24"/>
+        </w:rPr>
+        <w:t>Empathy Map Canvas:</w:t>
       </w:r>
     </w:p>
     <w:p>
       <w:pPr>
-        <w:spacing w:after="240" w:before="240" w:line="259" w:lineRule="auto"/>
+        <w:spacing w:before="240" w:after="240" w:line="259" w:lineRule="auto"/>
         <w:jc w:val="both"/>
         <w:rPr>
-          <w:rFonts w:ascii="Calibri" w:cs="Calibri" w:eastAsia="Calibri" w:hAnsi="Calibri"/>
-          <w:color w:val="2a2a2a"/>
+          <w:rFonts w:ascii="Calibri" w:eastAsia="Calibri" w:hAnsi="Calibri" w:cs="Calibri"/>
+          <w:color w:val="2A2A2A"/>
           <w:sz w:val="24"/>
           <w:szCs w:val="24"/>
         </w:rPr>
       </w:pPr>
       <w:r>
         <w:rPr>
-          <w:rFonts w:ascii="Calibri" w:cs="Calibri" w:eastAsia="Calibri" w:hAnsi="Calibri"/>
-          <w:color w:val="2a2a2a"/>
-          <w:sz w:val="24"/>
-          <w:szCs w:val="24"/>
-          <w:rtl w:val="0"/>
-        </w:rPr>
-        <w:t xml:space="preserve">Understand the needs, frustrations, and behaviors of freelance professionals s</w:t>
-      </w:r>
-      <w:r>
-        <w:rPr>
-          <w:rFonts w:ascii="Calibri" w:cs="Calibri" w:eastAsia="Calibri" w:hAnsi="Calibri"/>
+          <w:rFonts w:ascii="Calibri" w:eastAsia="Calibri" w:hAnsi="Calibri" w:cs="Calibri"/>
+          <w:color w:val="2A2A2A"/>
+          <w:sz w:val="24"/>
+          <w:szCs w:val="24"/>
+        </w:rPr>
+        <w:t>We’re empathizing with everyday social media users—especially 18–35—who want real-time, meaningful connection through chats, stories, and posts without the noise.</w:t>
+      </w:r>
+      <w:r>
+        <w:rPr>
+          <w:rFonts w:ascii="Calibri" w:eastAsia="Calibri" w:hAnsi="Calibri" w:cs="Calibri"/>
+          <w:color w:val="2A2A2A"/>
+          <w:sz w:val="24"/>
+          <w:szCs w:val="24"/>
+        </w:rPr>
+        <w:br/>
+        <w:t>They’re tired of cluttered feeds, spam, toxic interactions, and confusing privacy, and they want more control over what they see and who sees them.</w:t>
+      </w:r>
+      <w:r>
+        <w:rPr>
+          <w:rFonts w:ascii="Calibri" w:eastAsia="Calibri" w:hAnsi="Calibri" w:cs="Calibri"/>
+          <w:color w:val="2A2A2A"/>
+          <w:sz w:val="24"/>
+          <w:szCs w:val="24"/>
+        </w:rPr>
+        <w:br/>
+        <w:t>This also includes students, working professionals, and creators who want a cleaner, safer, more personal platform that respects their time and data.</w:t>
+      </w:r>
+    </w:p>
+    <w:p>
+      <w:pPr>
+        <w:spacing w:after="160" w:line="259" w:lineRule="auto"/>
+        <w:jc w:val="both"/>
+        <w:rPr>
+          <w:rFonts w:ascii="Calibri" w:eastAsia="Calibri" w:hAnsi="Calibri" w:cs="Calibri"/>
+          <w:color w:val="2A2A2A"/>
+          <w:sz w:val="24"/>
+          <w:szCs w:val="24"/>
+        </w:rPr>
+      </w:pPr>
+      <w:r>
+        <w:rPr>
+          <w:rFonts w:ascii="Calibri" w:eastAsia="Calibri" w:hAnsi="Calibri" w:cs="Calibri"/>
+          <w:b/>
+          <w:noProof/>
+          <w:color w:val="2A2A2A"/>
+          <w:sz w:val="24"/>
+          <w:szCs w:val="24"/>
         </w:rPr>
         <w:drawing>
-          <wp:inline distB="114300" distT="114300" distL="114300" distR="114300">
-            <wp:extent cx="5731200" cy="4178300"/>
-            <wp:effectExtent b="0" l="0" r="0" t="0"/>
-            <wp:docPr id="2" name="image1.png"/>
-            <a:graphic>
+          <wp:anchor distT="0" distB="0" distL="114300" distR="114300" simplePos="0" relativeHeight="251658240" behindDoc="0" locked="0" layoutInCell="1" allowOverlap="1" wp14:anchorId="751E139F" wp14:editId="5A938FB3">
+            <wp:simplePos x="0" y="0"/>
+            <wp:positionH relativeFrom="margin">
+              <wp:posOffset>-455930</wp:posOffset>
+            </wp:positionH>
+            <wp:positionV relativeFrom="paragraph">
+              <wp:posOffset>279400</wp:posOffset>
+            </wp:positionV>
+            <wp:extent cx="6492875" cy="3549650"/>
+            <wp:effectExtent l="0" t="0" r="3175" b="0"/>
+            <wp:wrapSquare wrapText="bothSides"/>
+            <wp:docPr id="822853329" name="Picture 1"/>
+            <wp:cNvGraphicFramePr>
+              <a:graphicFrameLocks xmlns:a="http://schemas.openxmlformats.org/drawingml/2006/main" noChangeAspect="1"/>
+            </wp:cNvGraphicFramePr>
+            <a:graphic xmlns:a="http://schemas.openxmlformats.org/drawingml/2006/main">
               <a:graphicData uri="http://schemas.openxmlformats.org/drawingml/2006/picture">
-                <pic:pic>
+                <pic:pic xmlns:pic="http://schemas.openxmlformats.org/drawingml/2006/picture">
                   <pic:nvPicPr>
-                    <pic:cNvPr id="0" name="image1.png"/>
-                    <pic:cNvPicPr preferRelativeResize="0"/>
+                    <pic:cNvPr id="822853329" name="Picture 822853329"/>
+                    <pic:cNvPicPr/>
                   </pic:nvPicPr>
                   <pic:blipFill>
-                    <a:blip r:embed="rId7"/>
-                    <a:srcRect b="0" l="0" r="0" t="0"/>
+                    <a:blip r:embed="rId5">
+                      <a:extLst>
+                        <a:ext uri="{28A0092B-C50C-407E-A947-70E740481C1C}">
+                          <a14:useLocalDpi xmlns:a14="http://schemas.microsoft.com/office/drawing/2010/main" val="0"/>
+                        </a:ext>
+                      </a:extLst>
+                    </a:blip>
                     <a:stretch>
                       <a:fillRect/>
                     </a:stretch>
@@ -332,33 +372,122 @@
                   <pic:spPr>
                     <a:xfrm>
                       <a:off x="0" y="0"/>
-                      <a:ext cx="5731200" cy="4178300"/>
+                      <a:ext cx="6492875" cy="3549650"/>
                     </a:xfrm>
-                    <a:prstGeom prst="rect"/>
-                    <a:ln/>
+                    <a:prstGeom prst="rect">
+                      <a:avLst/>
+                    </a:prstGeom>
                   </pic:spPr>
                 </pic:pic>
               </a:graphicData>
             </a:graphic>
-          </wp:inline>
+            <wp14:sizeRelH relativeFrom="margin">
+              <wp14:pctWidth>0</wp14:pctWidth>
+            </wp14:sizeRelH>
+            <wp14:sizeRelV relativeFrom="margin">
+              <wp14:pctHeight>0</wp14:pctHeight>
+            </wp14:sizeRelV>
+          </wp:anchor>
         </w:drawing>
       </w:r>
-      <w:r>
-        <w:rPr>
-          <w:rFonts w:ascii="Calibri" w:cs="Calibri" w:eastAsia="Calibri" w:hAnsi="Calibri"/>
-          <w:rtl w:val="0"/>
-        </w:rPr>
-        <w:t xml:space="preserve">s</w:t>
-      </w:r>
-      <w:r>
-        <w:rPr>
-          <w:rFonts w:ascii="Calibri" w:cs="Calibri" w:eastAsia="Calibri" w:hAnsi="Calibri"/>
-          <w:color w:val="2a2a2a"/>
-          <w:sz w:val="24"/>
-          <w:szCs w:val="24"/>
-          <w:rtl w:val="0"/>
-        </w:rPr>
-        <w:t xml:space="preserve">eeking consistent work through a platform like Freelance Finder.</w:t>
+    </w:p>
+    <w:p>
+      <w:pPr>
+        <w:spacing w:after="160" w:line="259" w:lineRule="auto"/>
+        <w:rPr>
+          <w:rFonts w:ascii="Calibri" w:eastAsia="Calibri" w:hAnsi="Calibri" w:cs="Calibri"/>
+          <w:sz w:val="24"/>
+          <w:szCs w:val="24"/>
+        </w:rPr>
+      </w:pPr>
+    </w:p>
+    <w:p>
+      <w:pPr>
+        <w:spacing w:after="160" w:line="259" w:lineRule="auto"/>
+        <w:rPr>
+          <w:rFonts w:ascii="Calibri" w:eastAsia="Calibri" w:hAnsi="Calibri" w:cs="Calibri"/>
+        </w:rPr>
+      </w:pPr>
+      <w:r>
+        <w:rPr>
+          <w:rFonts w:ascii="Calibri" w:eastAsia="Calibri" w:hAnsi="Calibri" w:cs="Calibri"/>
+          <w:sz w:val="24"/>
+          <w:szCs w:val="24"/>
+        </w:rPr>
+        <w:t>Reference:</w:t>
+      </w:r>
+      <w:r>
+        <w:rPr>
+          <w:rFonts w:ascii="Calibri" w:eastAsia="Calibri" w:hAnsi="Calibri" w:cs="Calibri"/>
+          <w:sz w:val="24"/>
+          <w:szCs w:val="24"/>
+        </w:rPr>
+        <w:t xml:space="preserve"> </w:t>
+      </w:r>
+      <w:r>
+        <w:rPr>
+          <w:rFonts w:ascii="Calibri" w:eastAsia="Calibri" w:hAnsi="Calibri" w:cs="Calibri"/>
+          <w:sz w:val="24"/>
+          <w:szCs w:val="24"/>
+        </w:rPr>
+        <w:fldChar w:fldCharType="begin"/>
+      </w:r>
+      <w:r>
+        <w:rPr>
+          <w:rFonts w:ascii="Calibri" w:eastAsia="Calibri" w:hAnsi="Calibri" w:cs="Calibri"/>
+          <w:sz w:val="24"/>
+          <w:szCs w:val="24"/>
+        </w:rPr>
+        <w:instrText>HYPERLINK "</w:instrText>
+      </w:r>
+      <w:r>
+        <w:rPr>
+          <w:rFonts w:ascii="Calibri" w:eastAsia="Calibri" w:hAnsi="Calibri" w:cs="Calibri"/>
+          <w:sz w:val="24"/>
+          <w:szCs w:val="24"/>
+        </w:rPr>
+        <w:instrText>https://app.mural.co/t/snehachakrabortyworkspace7690/m/snehachakrabortyworkspace7690/1765033716738/87deb3ee9696c7aa3c66a74eb0a71da89204fad8?sender=u300bd3bbbc54ced331566063</w:instrText>
+      </w:r>
+    </w:p>
+    <w:p>
+      <w:pPr>
+        <w:spacing w:after="160" w:line="259" w:lineRule="auto"/>
+        <w:rPr>
+          <w:rStyle w:val="Hyperlink"/>
+          <w:rFonts w:ascii="Calibri" w:eastAsia="Calibri" w:hAnsi="Calibri" w:cs="Calibri"/>
+        </w:rPr>
+      </w:pPr>
+      <w:r>
+        <w:rPr>
+          <w:rFonts w:ascii="Calibri" w:eastAsia="Calibri" w:hAnsi="Calibri" w:cs="Calibri"/>
+          <w:sz w:val="24"/>
+          <w:szCs w:val="24"/>
+        </w:rPr>
+        <w:instrText>"</w:instrText>
+      </w:r>
+      <w:r>
+        <w:rPr>
+          <w:rFonts w:ascii="Calibri" w:eastAsia="Calibri" w:hAnsi="Calibri" w:cs="Calibri"/>
+          <w:sz w:val="24"/>
+          <w:szCs w:val="24"/>
+        </w:rPr>
+      </w:r>
+      <w:r>
+        <w:rPr>
+          <w:rFonts w:ascii="Calibri" w:eastAsia="Calibri" w:hAnsi="Calibri" w:cs="Calibri"/>
+          <w:sz w:val="24"/>
+          <w:szCs w:val="24"/>
+        </w:rPr>
+        <w:fldChar w:fldCharType="separate"/>
+      </w:r>
+      <w:r>
+        <w:rPr>
+          <w:rStyle w:val="Hyperlink"/>
+          <w:rFonts w:ascii="Calibri" w:eastAsia="Calibri" w:hAnsi="Calibri" w:cs="Calibri"/>
+          <w:sz w:val="24"/>
+          <w:szCs w:val="24"/>
+        </w:rPr>
+        <w:t>https://app.mural.co/t/snehachakrabortyworkspace7690/m/snehachakrabortyworkspace7690/1765033716738/87deb3ee9696c7aa3c66a74eb0a71da89204fad8?sender=u300bd3bbbc54ced331566063</w:t>
       </w:r>
     </w:p>
     <w:p>
@@ -366,16 +495,20 @@
         <w:spacing w:after="160" w:line="259" w:lineRule="auto"/>
         <w:jc w:val="both"/>
         <w:rPr>
-          <w:rFonts w:ascii="Calibri" w:cs="Calibri" w:eastAsia="Calibri" w:hAnsi="Calibri"/>
-          <w:color w:val="2a2a2a"/>
+          <w:rFonts w:ascii="Calibri" w:eastAsia="Calibri" w:hAnsi="Calibri" w:cs="Calibri"/>
+          <w:b/>
+          <w:color w:val="2A2A2A"/>
           <w:sz w:val="24"/>
           <w:szCs w:val="24"/>
         </w:rPr>
       </w:pPr>
       <w:r>
         <w:rPr>
-          <w:rtl w:val="0"/>
-        </w:rPr>
+          <w:rFonts w:ascii="Calibri" w:eastAsia="Calibri" w:hAnsi="Calibri" w:cs="Calibri"/>
+          <w:sz w:val="24"/>
+          <w:szCs w:val="24"/>
+        </w:rPr>
+        <w:fldChar w:fldCharType="end"/>
       </w:r>
     </w:p>
     <w:p>
@@ -383,186 +516,57 @@
         <w:spacing w:after="160" w:line="259" w:lineRule="auto"/>
         <w:jc w:val="both"/>
         <w:rPr>
-          <w:rFonts w:ascii="Calibri" w:cs="Calibri" w:eastAsia="Calibri" w:hAnsi="Calibri"/>
-          <w:b w:val="1"/>
-          <w:color w:val="2a2a2a"/>
+          <w:rFonts w:ascii="Calibri" w:eastAsia="Calibri" w:hAnsi="Calibri" w:cs="Calibri"/>
+          <w:b/>
+          <w:color w:val="2A2A2A"/>
           <w:sz w:val="24"/>
           <w:szCs w:val="24"/>
         </w:rPr>
       </w:pPr>
-      <w:r>
-        <w:rPr>
-          <w:rtl w:val="0"/>
-        </w:rPr>
-      </w:r>
     </w:p>
     <w:p>
       <w:pPr>
         <w:spacing w:after="160" w:line="259" w:lineRule="auto"/>
         <w:jc w:val="both"/>
         <w:rPr>
-          <w:rFonts w:ascii="Calibri" w:cs="Calibri" w:eastAsia="Calibri" w:hAnsi="Calibri"/>
-          <w:b w:val="1"/>
-          <w:color w:val="2a2a2a"/>
+          <w:rFonts w:ascii="Calibri" w:eastAsia="Calibri" w:hAnsi="Calibri" w:cs="Calibri"/>
+          <w:b/>
+          <w:color w:val="2A2A2A"/>
           <w:sz w:val="24"/>
           <w:szCs w:val="24"/>
         </w:rPr>
       </w:pPr>
-      <w:r>
-        <w:rPr>
-          <w:rtl w:val="0"/>
-        </w:rPr>
-      </w:r>
     </w:p>
     <w:p>
       <w:pPr>
         <w:spacing w:after="160" w:line="259" w:lineRule="auto"/>
         <w:rPr>
-          <w:rFonts w:ascii="Calibri" w:cs="Calibri" w:eastAsia="Calibri" w:hAnsi="Calibri"/>
+          <w:rFonts w:ascii="Calibri" w:eastAsia="Calibri" w:hAnsi="Calibri" w:cs="Calibri"/>
           <w:sz w:val="24"/>
           <w:szCs w:val="24"/>
         </w:rPr>
       </w:pPr>
-      <w:r>
-        <w:rPr>
-          <w:rtl w:val="0"/>
-        </w:rPr>
-      </w:r>
     </w:p>
-    <w:p>
-      <w:pPr>
-        <w:spacing w:after="160" w:line="259" w:lineRule="auto"/>
-        <w:rPr>
-          <w:rFonts w:ascii="Calibri" w:cs="Calibri" w:eastAsia="Calibri" w:hAnsi="Calibri"/>
-        </w:rPr>
-      </w:pPr>
-      <w:r>
-        <w:rPr>
-          <w:rFonts w:ascii="Calibri" w:cs="Calibri" w:eastAsia="Calibri" w:hAnsi="Calibri"/>
-          <w:sz w:val="24"/>
-          <w:szCs w:val="24"/>
-          <w:rtl w:val="0"/>
-        </w:rPr>
-        <w:t xml:space="preserve">Reference: </w:t>
-      </w:r>
-      <w:hyperlink r:id="rId8">
-        <w:r>
-          <w:rPr>
-            <w:rFonts w:ascii="Calibri" w:cs="Calibri" w:eastAsia="Calibri" w:hAnsi="Calibri"/>
-            <w:color w:val="0563c1"/>
-            <w:u w:val="single"/>
-            <w:rtl w:val="0"/>
-          </w:rPr>
-          <w:t xml:space="preserve">https://www.mural.co/templates/empathy-map-canvas</w:t>
-        </w:r>
-      </w:hyperlink>
-      <w:r>
-        <w:rPr>
-          <w:rtl w:val="0"/>
-        </w:rPr>
-      </w:r>
-    </w:p>
-    <w:p>
-      <w:pPr>
-        <w:spacing w:after="160" w:line="259" w:lineRule="auto"/>
-        <w:jc w:val="both"/>
-        <w:rPr>
-          <w:rFonts w:ascii="Calibri" w:cs="Calibri" w:eastAsia="Calibri" w:hAnsi="Calibri"/>
-          <w:b w:val="1"/>
-          <w:color w:val="2a2a2a"/>
-          <w:sz w:val="24"/>
-          <w:szCs w:val="24"/>
-        </w:rPr>
-      </w:pPr>
-      <w:r>
-        <w:rPr>
-          <w:rtl w:val="0"/>
-        </w:rPr>
-      </w:r>
-    </w:p>
-    <w:p>
-      <w:pPr>
-        <w:spacing w:after="160" w:line="259" w:lineRule="auto"/>
-        <w:jc w:val="both"/>
-        <w:rPr>
-          <w:rFonts w:ascii="Calibri" w:cs="Calibri" w:eastAsia="Calibri" w:hAnsi="Calibri"/>
-          <w:b w:val="1"/>
-          <w:color w:val="2a2a2a"/>
-          <w:sz w:val="24"/>
-          <w:szCs w:val="24"/>
-        </w:rPr>
-      </w:pPr>
-      <w:r>
-        <w:rPr>
-          <w:rtl w:val="0"/>
-        </w:rPr>
-      </w:r>
-    </w:p>
-    <w:p>
-      <w:pPr>
-        <w:spacing w:after="160" w:line="259" w:lineRule="auto"/>
-        <w:jc w:val="both"/>
-        <w:rPr>
-          <w:rFonts w:ascii="Calibri" w:cs="Calibri" w:eastAsia="Calibri" w:hAnsi="Calibri"/>
-          <w:b w:val="1"/>
-          <w:color w:val="2a2a2a"/>
-          <w:sz w:val="24"/>
-          <w:szCs w:val="24"/>
-        </w:rPr>
-      </w:pPr>
-      <w:r>
-        <w:rPr>
-          <w:rtl w:val="0"/>
-        </w:rPr>
-      </w:r>
-    </w:p>
-    <w:p>
-      <w:pPr>
-        <w:spacing w:after="160" w:line="259" w:lineRule="auto"/>
-        <w:rPr>
-          <w:rFonts w:ascii="Calibri" w:cs="Calibri" w:eastAsia="Calibri" w:hAnsi="Calibri"/>
-          <w:sz w:val="24"/>
-          <w:szCs w:val="24"/>
-        </w:rPr>
-      </w:pPr>
-      <w:r>
-        <w:rPr>
-          <w:rtl w:val="0"/>
-        </w:rPr>
-      </w:r>
-    </w:p>
-    <w:p>
-      <w:pPr>
-        <w:rPr/>
-      </w:pPr>
-      <w:r>
-        <w:rPr>
-          <w:rtl w:val="0"/>
-        </w:rPr>
-      </w:r>
-    </w:p>
+    <w:p/>
     <w:sectPr>
-      <w:pgSz w:h="16834" w:w="11909" w:orient="portrait"/>
-      <w:pgMar w:bottom="1440" w:top="1440" w:left="1440" w:right="1440" w:header="720" w:footer="720"/>
+      <w:pgSz w:w="11909" w:h="16834"/>
+      <w:pgMar w:top="1440" w:right="1440" w:bottom="1440" w:left="1440" w:header="720" w:footer="720" w:gutter="0"/>
       <w:pgNumType w:start="1"/>
+      <w:cols w:space="720"/>
     </w:sectPr>
   </w:body>
 </w:document>
 </file>
 
-<file path=word/numbering.xml><?xml version="1.0" encoding="utf-8"?>
-<w:numbering xmlns:mc="http://schemas.openxmlformats.org/markup-compatibility/2006" xmlns:o="urn:schemas-microsoft-com:office:office" xmlns:r="http://schemas.openxmlformats.org/officeDocument/2006/relationships" xmlns:m="http://schemas.openxmlformats.org/officeDocument/2006/math" xmlns:v="urn:schemas-microsoft-com:vml" xmlns:wp="http://schemas.openxmlformats.org/drawingml/2006/wordprocessingDrawing" xmlns:w10="urn:schemas-microsoft-com:office:word" xmlns:w="http://schemas.openxmlformats.org/wordprocessingml/2006/main" xmlns:wne="http://schemas.microsoft.com/office/word/2006/wordml" xmlns:sl="http://schemas.openxmlformats.org/schemaLibrary/2006/main" xmlns:a="http://schemas.openxmlformats.org/drawingml/2006/main" xmlns:pic="http://schemas.openxmlformats.org/drawingml/2006/picture" xmlns:c="http://schemas.openxmlformats.org/drawingml/2006/chart" xmlns:lc="http://schemas.openxmlformats.org/drawingml/2006/lockedCanvas" xmlns:dgm="http://schemas.openxmlformats.org/drawingml/2006/diagram" xmlns:wps="http://schemas.microsoft.com/office/word/2010/wordprocessingShape" xmlns:wpg="http://schemas.microsoft.com/office/word/2010/wordprocessingGroup" xmlns:w14="http://schemas.microsoft.com/office/word/2010/wordml" xmlns:w15="http://schemas.microsoft.com/office/word/2012/wordml" xmlns:w16="http://schemas.microsoft.com/office/word/2018/wordml" xmlns:w16cex="http://schemas.microsoft.com/office/word/2018/wordml/cex" xmlns:w16cid="http://schemas.microsoft.com/office/word/2016/wordml/cid" xmlns="http://schemas.microsoft.com/office/tasks/2019/documenttasks" xmlns:cr="http://schemas.microsoft.com/office/comments/2020/reactions"/>
-</file>
-
 <file path=word/styles.xml><?xml version="1.0" encoding="utf-8"?>
-<w:styles xmlns:mc="http://schemas.openxmlformats.org/markup-compatibility/2006" xmlns:o="urn:schemas-microsoft-com:office:office" xmlns:r="http://schemas.openxmlformats.org/officeDocument/2006/relationships" xmlns:m="http://schemas.openxmlformats.org/officeDocument/2006/math" xmlns:v="urn:schemas-microsoft-com:vml" xmlns:wp="http://schemas.openxmlformats.org/drawingml/2006/wordprocessingDrawing" xmlns:w10="urn:schemas-microsoft-com:office:word" xmlns:w="http://schemas.openxmlformats.org/wordprocessingml/2006/main" xmlns:wne="http://schemas.microsoft.com/office/word/2006/wordml" xmlns:sl="http://schemas.openxmlformats.org/schemaLibrary/2006/main" xmlns:a="http://schemas.openxmlformats.org/drawingml/2006/main" xmlns:pic="http://schemas.openxmlformats.org/drawingml/2006/picture" xmlns:c="http://schemas.openxmlformats.org/drawingml/2006/chart" xmlns:lc="http://schemas.openxmlformats.org/drawingml/2006/lockedCanvas" xmlns:dgm="http://schemas.openxmlformats.org/drawingml/2006/diagram" xmlns:wps="http://schemas.microsoft.com/office/word/2010/wordprocessingShape" xmlns:wpg="http://schemas.microsoft.com/office/word/2010/wordprocessingGroup" xmlns:w14="http://schemas.microsoft.com/office/word/2010/wordml" xmlns:w15="http://schemas.microsoft.com/office/word/2012/wordml" xmlns:w16="http://schemas.microsoft.com/office/word/2018/wordml" xmlns:w16cex="http://schemas.microsoft.com/office/word/2018/wordml/cex" xmlns:w16cid="http://schemas.microsoft.com/office/word/2016/wordml/cid" xmlns="http://schemas.microsoft.com/office/tasks/2019/documenttasks" xmlns:cr="http://schemas.microsoft.com/office/comments/2020/reactions">
+<w:styles xmlns:mc="http://schemas.openxmlformats.org/markup-compatibility/2006" xmlns:r="http://schemas.openxmlformats.org/officeDocument/2006/relationships" xmlns:w="http://schemas.openxmlformats.org/wordprocessingml/2006/main" xmlns:w14="http://schemas.microsoft.com/office/word/2010/wordml" xmlns:w15="http://schemas.microsoft.com/office/word/2012/wordml" xmlns:w16cex="http://schemas.microsoft.com/office/word/2018/wordml/cex" xmlns:w16cid="http://schemas.microsoft.com/office/word/2016/wordml/cid" xmlns:w16="http://schemas.microsoft.com/office/word/2018/wordml" xmlns:w16du="http://schemas.microsoft.com/office/word/2023/wordml/word16du" xmlns:w16sdtdh="http://schemas.microsoft.com/office/word/2020/wordml/sdtdatahash" xmlns:w16sdtfl="http://schemas.microsoft.com/office/word/2024/wordml/sdtformatlock" xmlns:w16se="http://schemas.microsoft.com/office/word/2015/wordml/symex" mc:Ignorable="w14 w15 w16se w16cid w16 w16cex w16sdtdh w16sdtfl w16du">
   <w:docDefaults>
     <w:rPrDefault>
       <w:rPr>
-        <w:rFonts w:ascii="Arial" w:cs="Arial" w:eastAsia="Arial" w:hAnsi="Arial"/>
+        <w:rFonts w:ascii="Arial" w:eastAsia="Arial" w:hAnsi="Arial" w:cs="Arial"/>
         <w:sz w:val="22"/>
         <w:szCs w:val="22"/>
-        <w:lang w:val="en_GB"/>
+        <w:lang w:val="en-GB" w:eastAsia="en-IN" w:bidi="ar-SA"/>
       </w:rPr>
     </w:rPrDefault>
     <w:pPrDefault>
@@ -571,29 +575,399 @@
       </w:pPr>
     </w:pPrDefault>
   </w:docDefaults>
-  <w:style w:type="table" w:styleId="TableNormal" w:default="1">
-    <w:name w:val="TableNormal"/>
-    <w:tblPr>
-      <w:tblCellMar>
-        <w:top w:w="100.0" w:type="dxa"/>
-        <w:left w:w="100.0" w:type="dxa"/>
-        <w:bottom w:w="100.0" w:type="dxa"/>
-        <w:right w:w="100.0" w:type="dxa"/>
-      </w:tblCellMar>
-    </w:tblPr>
-  </w:style>
-  <w:style w:type="paragraph" w:styleId="Normal" w:default="1">
-    <w:name w:val="normal"/>
+  <w:latentStyles w:defLockedState="0" w:defUIPriority="99" w:defSemiHidden="0" w:defUnhideWhenUsed="0" w:defQFormat="0" w:count="376">
+    <w:lsdException w:name="Normal" w:uiPriority="0" w:qFormat="1"/>
+    <w:lsdException w:name="heading 1" w:uiPriority="9" w:qFormat="1"/>
+    <w:lsdException w:name="heading 2" w:semiHidden="1" w:uiPriority="9" w:unhideWhenUsed="1" w:qFormat="1"/>
+    <w:lsdException w:name="heading 3" w:semiHidden="1" w:uiPriority="9" w:unhideWhenUsed="1" w:qFormat="1"/>
+    <w:lsdException w:name="heading 4" w:semiHidden="1" w:uiPriority="9" w:unhideWhenUsed="1" w:qFormat="1"/>
+    <w:lsdException w:name="heading 5" w:semiHidden="1" w:uiPriority="9" w:unhideWhenUsed="1" w:qFormat="1"/>
+    <w:lsdException w:name="heading 6" w:semiHidden="1" w:uiPriority="9" w:unhideWhenUsed="1" w:qFormat="1"/>
+    <w:lsdException w:name="heading 7" w:semiHidden="1" w:uiPriority="9" w:unhideWhenUsed="1" w:qFormat="1"/>
+    <w:lsdException w:name="heading 8" w:semiHidden="1" w:uiPriority="9" w:unhideWhenUsed="1" w:qFormat="1"/>
+    <w:lsdException w:name="heading 9" w:semiHidden="1" w:uiPriority="9" w:unhideWhenUsed="1" w:qFormat="1"/>
+    <w:lsdException w:name="index 1" w:semiHidden="1" w:unhideWhenUsed="1"/>
+    <w:lsdException w:name="index 2" w:semiHidden="1" w:unhideWhenUsed="1"/>
+    <w:lsdException w:name="index 3" w:semiHidden="1" w:unhideWhenUsed="1"/>
+    <w:lsdException w:name="index 4" w:semiHidden="1" w:unhideWhenUsed="1"/>
+    <w:lsdException w:name="index 5" w:semiHidden="1" w:unhideWhenUsed="1"/>
+    <w:lsdException w:name="index 6" w:semiHidden="1" w:unhideWhenUsed="1"/>
+    <w:lsdException w:name="index 7" w:semiHidden="1" w:unhideWhenUsed="1"/>
+    <w:lsdException w:name="index 8" w:semiHidden="1" w:unhideWhenUsed="1"/>
+    <w:lsdException w:name="index 9" w:semiHidden="1" w:unhideWhenUsed="1"/>
+    <w:lsdException w:name="toc 1" w:semiHidden="1" w:uiPriority="39" w:unhideWhenUsed="1"/>
+    <w:lsdException w:name="toc 2" w:semiHidden="1" w:uiPriority="39" w:unhideWhenUsed="1"/>
+    <w:lsdException w:name="toc 3" w:semiHidden="1" w:uiPriority="39" w:unhideWhenUsed="1"/>
+    <w:lsdException w:name="toc 4" w:semiHidden="1" w:uiPriority="39" w:unhideWhenUsed="1"/>
+    <w:lsdException w:name="toc 5" w:semiHidden="1" w:uiPriority="39" w:unhideWhenUsed="1"/>
+    <w:lsdException w:name="toc 6" w:semiHidden="1" w:uiPriority="39" w:unhideWhenUsed="1"/>
+    <w:lsdException w:name="toc 7" w:semiHidden="1" w:uiPriority="39" w:unhideWhenUsed="1"/>
+    <w:lsdException w:name="toc 8" w:semiHidden="1" w:uiPriority="39" w:unhideWhenUsed="1"/>
+    <w:lsdException w:name="toc 9" w:semiHidden="1" w:uiPriority="39" w:unhideWhenUsed="1"/>
+    <w:lsdException w:name="Normal Indent" w:semiHidden="1" w:unhideWhenUsed="1"/>
+    <w:lsdException w:name="footnote text" w:semiHidden="1" w:unhideWhenUsed="1"/>
+    <w:lsdException w:name="annotation text" w:semiHidden="1" w:unhideWhenUsed="1"/>
+    <w:lsdException w:name="header" w:semiHidden="1" w:unhideWhenUsed="1"/>
+    <w:lsdException w:name="footer" w:semiHidden="1" w:unhideWhenUsed="1"/>
+    <w:lsdException w:name="index heading" w:semiHidden="1" w:unhideWhenUsed="1"/>
+    <w:lsdException w:name="caption" w:semiHidden="1" w:uiPriority="35" w:unhideWhenUsed="1" w:qFormat="1"/>
+    <w:lsdException w:name="table of figures" w:semiHidden="1" w:unhideWhenUsed="1"/>
+    <w:lsdException w:name="envelope address" w:semiHidden="1" w:unhideWhenUsed="1"/>
+    <w:lsdException w:name="envelope return" w:semiHidden="1" w:unhideWhenUsed="1"/>
+    <w:lsdException w:name="footnote reference" w:semiHidden="1" w:unhideWhenUsed="1"/>
+    <w:lsdException w:name="annotation reference" w:semiHidden="1" w:unhideWhenUsed="1"/>
+    <w:lsdException w:name="line number" w:semiHidden="1" w:unhideWhenUsed="1"/>
+    <w:lsdException w:name="page number" w:semiHidden="1" w:unhideWhenUsed="1"/>
+    <w:lsdException w:name="endnote reference" w:semiHidden="1" w:unhideWhenUsed="1"/>
+    <w:lsdException w:name="endnote text" w:semiHidden="1" w:unhideWhenUsed="1"/>
+    <w:lsdException w:name="table of authorities" w:semiHidden="1" w:unhideWhenUsed="1"/>
+    <w:lsdException w:name="macro" w:semiHidden="1" w:unhideWhenUsed="1"/>
+    <w:lsdException w:name="toa heading" w:semiHidden="1" w:unhideWhenUsed="1"/>
+    <w:lsdException w:name="List" w:semiHidden="1" w:unhideWhenUsed="1"/>
+    <w:lsdException w:name="List Bullet" w:semiHidden="1" w:unhideWhenUsed="1"/>
+    <w:lsdException w:name="List Number" w:semiHidden="1" w:unhideWhenUsed="1"/>
+    <w:lsdException w:name="List 2" w:semiHidden="1" w:unhideWhenUsed="1"/>
+    <w:lsdException w:name="List 3" w:semiHidden="1" w:unhideWhenUsed="1"/>
+    <w:lsdException w:name="List 4" w:semiHidden="1" w:unhideWhenUsed="1"/>
+    <w:lsdException w:name="List 5" w:semiHidden="1" w:unhideWhenUsed="1"/>
+    <w:lsdException w:name="List Bullet 2" w:semiHidden="1" w:unhideWhenUsed="1"/>
+    <w:lsdException w:name="List Bullet 3" w:semiHidden="1" w:unhideWhenUsed="1"/>
+    <w:lsdException w:name="List Bullet 4" w:semiHidden="1" w:unhideWhenUsed="1"/>
+    <w:lsdException w:name="List Bullet 5" w:semiHidden="1" w:unhideWhenUsed="1"/>
+    <w:lsdException w:name="List Number 2" w:semiHidden="1" w:unhideWhenUsed="1"/>
+    <w:lsdException w:name="List Number 3" w:semiHidden="1" w:unhideWhenUsed="1"/>
+    <w:lsdException w:name="List Number 4" w:semiHidden="1" w:unhideWhenUsed="1"/>
+    <w:lsdException w:name="List Number 5" w:semiHidden="1" w:unhideWhenUsed="1"/>
+    <w:lsdException w:name="Title" w:uiPriority="10" w:qFormat="1"/>
+    <w:lsdException w:name="Closing" w:semiHidden="1" w:unhideWhenUsed="1"/>
+    <w:lsdException w:name="Signature" w:semiHidden="1" w:unhideWhenUsed="1"/>
+    <w:lsdException w:name="Default Paragraph Font" w:semiHidden="1" w:uiPriority="1" w:unhideWhenUsed="1"/>
+    <w:lsdException w:name="Body Text" w:semiHidden="1" w:unhideWhenUsed="1"/>
+    <w:lsdException w:name="Body Text Indent" w:semiHidden="1" w:unhideWhenUsed="1"/>
+    <w:lsdException w:name="List Continue" w:semiHidden="1" w:unhideWhenUsed="1"/>
+    <w:lsdException w:name="List Continue 2" w:semiHidden="1" w:unhideWhenUsed="1"/>
+    <w:lsdException w:name="List Continue 3" w:semiHidden="1" w:unhideWhenUsed="1"/>
+    <w:lsdException w:name="List Continue 4" w:semiHidden="1" w:unhideWhenUsed="1"/>
+    <w:lsdException w:name="List Continue 5" w:semiHidden="1" w:unhideWhenUsed="1"/>
+    <w:lsdException w:name="Message Header" w:semiHidden="1" w:unhideWhenUsed="1"/>
+    <w:lsdException w:name="Subtitle" w:uiPriority="11" w:qFormat="1"/>
+    <w:lsdException w:name="Salutation" w:semiHidden="1" w:unhideWhenUsed="1"/>
+    <w:lsdException w:name="Date" w:semiHidden="1" w:unhideWhenUsed="1"/>
+    <w:lsdException w:name="Body Text First Indent" w:semiHidden="1" w:unhideWhenUsed="1"/>
+    <w:lsdException w:name="Body Text First Indent 2" w:semiHidden="1" w:unhideWhenUsed="1"/>
+    <w:lsdException w:name="Note Heading" w:semiHidden="1" w:unhideWhenUsed="1"/>
+    <w:lsdException w:name="Body Text 2" w:semiHidden="1" w:unhideWhenUsed="1"/>
+    <w:lsdException w:name="Body Text 3" w:semiHidden="1" w:unhideWhenUsed="1"/>
+    <w:lsdException w:name="Body Text Indent 2" w:semiHidden="1" w:unhideWhenUsed="1"/>
+    <w:lsdException w:name="Body Text Indent 3" w:semiHidden="1" w:unhideWhenUsed="1"/>
+    <w:lsdException w:name="Block Text" w:semiHidden="1" w:unhideWhenUsed="1"/>
+    <w:lsdException w:name="Hyperlink" w:semiHidden="1" w:unhideWhenUsed="1"/>
+    <w:lsdException w:name="FollowedHyperlink" w:semiHidden="1" w:unhideWhenUsed="1"/>
+    <w:lsdException w:name="Strong" w:uiPriority="22" w:qFormat="1"/>
+    <w:lsdException w:name="Emphasis" w:uiPriority="20" w:qFormat="1"/>
+    <w:lsdException w:name="Document Map" w:semiHidden="1" w:unhideWhenUsed="1"/>
+    <w:lsdException w:name="Plain Text" w:semiHidden="1" w:unhideWhenUsed="1"/>
+    <w:lsdException w:name="E-mail Signature" w:semiHidden="1" w:unhideWhenUsed="1"/>
+    <w:lsdException w:name="HTML Top of Form" w:semiHidden="1" w:unhideWhenUsed="1"/>
+    <w:lsdException w:name="HTML Bottom of Form" w:semiHidden="1" w:unhideWhenUsed="1"/>
+    <w:lsdException w:name="Normal (Web)" w:semiHidden="1" w:unhideWhenUsed="1"/>
+    <w:lsdException w:name="HTML Acronym" w:semiHidden="1" w:unhideWhenUsed="1"/>
+    <w:lsdException w:name="HTML Address" w:semiHidden="1" w:unhideWhenUsed="1"/>
+    <w:lsdException w:name="HTML Cite" w:semiHidden="1" w:unhideWhenUsed="1"/>
+    <w:lsdException w:name="HTML Code" w:semiHidden="1" w:unhideWhenUsed="1"/>
+    <w:lsdException w:name="HTML Definition" w:semiHidden="1" w:unhideWhenUsed="1"/>
+    <w:lsdException w:name="HTML Keyboard" w:semiHidden="1" w:unhideWhenUsed="1"/>
+    <w:lsdException w:name="HTML Preformatted" w:semiHidden="1" w:unhideWhenUsed="1"/>
+    <w:lsdException w:name="HTML Sample" w:semiHidden="1" w:unhideWhenUsed="1"/>
+    <w:lsdException w:name="HTML Typewriter" w:semiHidden="1" w:unhideWhenUsed="1"/>
+    <w:lsdException w:name="HTML Variable" w:semiHidden="1" w:unhideWhenUsed="1"/>
+    <w:lsdException w:name="Normal Table" w:semiHidden="1" w:unhideWhenUsed="1"/>
+    <w:lsdException w:name="annotation subject" w:semiHidden="1" w:unhideWhenUsed="1"/>
+    <w:lsdException w:name="No List" w:semiHidden="1" w:unhideWhenUsed="1"/>
+    <w:lsdException w:name="Outline List 1" w:semiHidden="1" w:unhideWhenUsed="1"/>
+    <w:lsdException w:name="Outline List 2" w:semiHidden="1" w:unhideWhenUsed="1"/>
+    <w:lsdException w:name="Outline List 3" w:semiHidden="1" w:unhideWhenUsed="1"/>
+    <w:lsdException w:name="Table Simple 1" w:semiHidden="1" w:unhideWhenUsed="1"/>
+    <w:lsdException w:name="Table Simple 2" w:semiHidden="1" w:unhideWhenUsed="1"/>
+    <w:lsdException w:name="Table Simple 3" w:semiHidden="1" w:unhideWhenUsed="1"/>
+    <w:lsdException w:name="Table Classic 1" w:semiHidden="1" w:unhideWhenUsed="1"/>
+    <w:lsdException w:name="Table Classic 2" w:semiHidden="1" w:unhideWhenUsed="1"/>
+    <w:lsdException w:name="Table Classic 3" w:semiHidden="1" w:unhideWhenUsed="1"/>
+    <w:lsdException w:name="Table Classic 4" w:semiHidden="1" w:unhideWhenUsed="1"/>
+    <w:lsdException w:name="Table Colorful 1" w:semiHidden="1" w:unhideWhenUsed="1"/>
+    <w:lsdException w:name="Table Colorful 2" w:semiHidden="1" w:unhideWhenUsed="1"/>
+    <w:lsdException w:name="Table Colorful 3" w:semiHidden="1" w:unhideWhenUsed="1"/>
+    <w:lsdException w:name="Table Columns 1" w:semiHidden="1" w:unhideWhenUsed="1"/>
+    <w:lsdException w:name="Table Columns 2" w:semiHidden="1" w:unhideWhenUsed="1"/>
+    <w:lsdException w:name="Table Columns 3" w:semiHidden="1" w:unhideWhenUsed="1"/>
+    <w:lsdException w:name="Table Columns 4" w:semiHidden="1" w:unhideWhenUsed="1"/>
+    <w:lsdException w:name="Table Columns 5" w:semiHidden="1" w:unhideWhenUsed="1"/>
+    <w:lsdException w:name="Table Grid 1" w:semiHidden="1" w:unhideWhenUsed="1"/>
+    <w:lsdException w:name="Table Grid 2" w:semiHidden="1" w:unhideWhenUsed="1"/>
+    <w:lsdException w:name="Table Grid 3" w:semiHidden="1" w:unhideWhenUsed="1"/>
+    <w:lsdException w:name="Table Grid 4" w:semiHidden="1" w:unhideWhenUsed="1"/>
+    <w:lsdException w:name="Table Grid 5" w:semiHidden="1" w:unhideWhenUsed="1"/>
+    <w:lsdException w:name="Table Grid 6" w:semiHidden="1" w:unhideWhenUsed="1"/>
+    <w:lsdException w:name="Table Grid 7" w:semiHidden="1" w:unhideWhenUsed="1"/>
+    <w:lsdException w:name="Table Grid 8" w:semiHidden="1" w:unhideWhenUsed="1"/>
+    <w:lsdException w:name="Table List 1" w:semiHidden="1" w:unhideWhenUsed="1"/>
+    <w:lsdException w:name="Table List 2" w:semiHidden="1" w:unhideWhenUsed="1"/>
+    <w:lsdException w:name="Table List 3" w:semiHidden="1" w:unhideWhenUsed="1"/>
+    <w:lsdException w:name="Table List 4" w:semiHidden="1" w:unhideWhenUsed="1"/>
+    <w:lsdException w:name="Table List 5" w:semiHidden="1" w:unhideWhenUsed="1"/>
+    <w:lsdException w:name="Table List 6" w:semiHidden="1" w:unhideWhenUsed="1"/>
+    <w:lsdException w:name="Table List 7" w:semiHidden="1" w:unhideWhenUsed="1"/>
+    <w:lsdException w:name="Table List 8" w:semiHidden="1" w:unhideWhenUsed="1"/>
+    <w:lsdException w:name="Table 3D effects 1" w:semiHidden="1" w:unhideWhenUsed="1"/>
+    <w:lsdException w:name="Table 3D effects 2" w:semiHidden="1" w:unhideWhenUsed="1"/>
+    <w:lsdException w:name="Table 3D effects 3" w:semiHidden="1" w:unhideWhenUsed="1"/>
+    <w:lsdException w:name="Table Contemporary" w:semiHidden="1" w:unhideWhenUsed="1"/>
+    <w:lsdException w:name="Table Elegant" w:semiHidden="1" w:unhideWhenUsed="1"/>
+    <w:lsdException w:name="Table Professional" w:semiHidden="1" w:unhideWhenUsed="1"/>
+    <w:lsdException w:name="Table Subtle 1" w:semiHidden="1" w:unhideWhenUsed="1"/>
+    <w:lsdException w:name="Table Subtle 2" w:semiHidden="1" w:unhideWhenUsed="1"/>
+    <w:lsdException w:name="Table Web 1" w:semiHidden="1" w:unhideWhenUsed="1"/>
+    <w:lsdException w:name="Table Web 2" w:semiHidden="1" w:unhideWhenUsed="1"/>
+    <w:lsdException w:name="Table Web 3" w:semiHidden="1" w:unhideWhenUsed="1"/>
+    <w:lsdException w:name="Balloon Text" w:semiHidden="1" w:unhideWhenUsed="1"/>
+    <w:lsdException w:name="Table Grid" w:uiPriority="39"/>
+    <w:lsdException w:name="Table Theme" w:semiHidden="1" w:unhideWhenUsed="1"/>
+    <w:lsdException w:name="Placeholder Text" w:semiHidden="1"/>
+    <w:lsdException w:name="No Spacing" w:uiPriority="1" w:qFormat="1"/>
+    <w:lsdException w:name="Light Shading" w:uiPriority="60"/>
+    <w:lsdException w:name="Light List" w:uiPriority="61"/>
+    <w:lsdException w:name="Light Grid" w:uiPriority="62"/>
+    <w:lsdException w:name="Medium Shading 1" w:uiPriority="63"/>
+    <w:lsdException w:name="Medium Shading 2" w:uiPriority="64"/>
+    <w:lsdException w:name="Medium List 1" w:uiPriority="65"/>
+    <w:lsdException w:name="Medium List 2" w:uiPriority="66"/>
+    <w:lsdException w:name="Medium Grid 1" w:uiPriority="67"/>
+    <w:lsdException w:name="Medium Grid 2" w:uiPriority="68"/>
+    <w:lsdException w:name="Medium Grid 3" w:uiPriority="69"/>
+    <w:lsdException w:name="Dark List" w:uiPriority="70"/>
+    <w:lsdException w:name="Colorful Shading" w:uiPriority="71"/>
+    <w:lsdException w:name="Colorful List" w:uiPriority="72"/>
+    <w:lsdException w:name="Colorful Grid" w:uiPriority="73"/>
+    <w:lsdException w:name="Light Shading Accent 1" w:uiPriority="60"/>
+    <w:lsdException w:name="Light List Accent 1" w:uiPriority="61"/>
+    <w:lsdException w:name="Light Grid Accent 1" w:uiPriority="62"/>
+    <w:lsdException w:name="Medium Shading 1 Accent 1" w:uiPriority="63"/>
+    <w:lsdException w:name="Medium Shading 2 Accent 1" w:uiPriority="64"/>
+    <w:lsdException w:name="Medium List 1 Accent 1" w:uiPriority="65"/>
+    <w:lsdException w:name="Revision" w:semiHidden="1"/>
+    <w:lsdException w:name="List Paragraph" w:uiPriority="34" w:qFormat="1"/>
+    <w:lsdException w:name="Quote" w:uiPriority="29" w:qFormat="1"/>
+    <w:lsdException w:name="Intense Quote" w:uiPriority="30" w:qFormat="1"/>
+    <w:lsdException w:name="Medium List 2 Accent 1" w:uiPriority="66"/>
+    <w:lsdException w:name="Medium Grid 1 Accent 1" w:uiPriority="67"/>
+    <w:lsdException w:name="Medium Grid 2 Accent 1" w:uiPriority="68"/>
+    <w:lsdException w:name="Medium Grid 3 Accent 1" w:uiPriority="69"/>
+    <w:lsdException w:name="Dark List Accent 1" w:uiPriority="70"/>
+    <w:lsdException w:name="Colorful Shading Accent 1" w:uiPriority="71"/>
+    <w:lsdException w:name="Colorful List Accent 1" w:uiPriority="72"/>
+    <w:lsdException w:name="Colorful Grid Accent 1" w:uiPriority="73"/>
+    <w:lsdException w:name="Light Shading Accent 2" w:uiPriority="60"/>
+    <w:lsdException w:name="Light List Accent 2" w:uiPriority="61"/>
+    <w:lsdException w:name="Light Grid Accent 2" w:uiPriority="62"/>
+    <w:lsdException w:name="Medium Shading 1 Accent 2" w:uiPriority="63"/>
+    <w:lsdException w:name="Medium Shading 2 Accent 2" w:uiPriority="64"/>
+    <w:lsdException w:name="Medium List 1 Accent 2" w:uiPriority="65"/>
+    <w:lsdException w:name="Medium List 2 Accent 2" w:uiPriority="66"/>
+    <w:lsdException w:name="Medium Grid 1 Accent 2" w:uiPriority="67"/>
+    <w:lsdException w:name="Medium Grid 2 Accent 2" w:uiPriority="68"/>
+    <w:lsdException w:name="Medium Grid 3 Accent 2" w:uiPriority="69"/>
+    <w:lsdException w:name="Dark List Accent 2" w:uiPriority="70"/>
+    <w:lsdException w:name="Colorful Shading Accent 2" w:uiPriority="71"/>
+    <w:lsdException w:name="Colorful List Accent 2" w:uiPriority="72"/>
+    <w:lsdException w:name="Colorful Grid Accent 2" w:uiPriority="73"/>
+    <w:lsdException w:name="Light Shading Accent 3" w:uiPriority="60"/>
+    <w:lsdException w:name="Light List Accent 3" w:uiPriority="61"/>
+    <w:lsdException w:name="Light Grid Accent 3" w:uiPriority="62"/>
+    <w:lsdException w:name="Medium Shading 1 Accent 3" w:uiPriority="63"/>
+    <w:lsdException w:name="Medium Shading 2 Accent 3" w:uiPriority="64"/>
+    <w:lsdException w:name="Medium List 1 Accent 3" w:uiPriority="65"/>
+    <w:lsdException w:name="Medium List 2 Accent 3" w:uiPriority="66"/>
+    <w:lsdException w:name="Medium Grid 1 Accent 3" w:uiPriority="67"/>
+    <w:lsdException w:name="Medium Grid 2 Accent 3" w:uiPriority="68"/>
+    <w:lsdException w:name="Medium Grid 3 Accent 3" w:uiPriority="69"/>
+    <w:lsdException w:name="Dark List Accent 3" w:uiPriority="70"/>
+    <w:lsdException w:name="Colorful Shading Accent 3" w:uiPriority="71"/>
+    <w:lsdException w:name="Colorful List Accent 3" w:uiPriority="72"/>
+    <w:lsdException w:name="Colorful Grid Accent 3" w:uiPriority="73"/>
+    <w:lsdException w:name="Light Shading Accent 4" w:uiPriority="60"/>
+    <w:lsdException w:name="Light List Accent 4" w:uiPriority="61"/>
+    <w:lsdException w:name="Light Grid Accent 4" w:uiPriority="62"/>
+    <w:lsdException w:name="Medium Shading 1 Accent 4" w:uiPriority="63"/>
+    <w:lsdException w:name="Medium Shading 2 Accent 4" w:uiPriority="64"/>
+    <w:lsdException w:name="Medium List 1 Accent 4" w:uiPriority="65"/>
+    <w:lsdException w:name="Medium List 2 Accent 4" w:uiPriority="66"/>
+    <w:lsdException w:name="Medium Grid 1 Accent 4" w:uiPriority="67"/>
+    <w:lsdException w:name="Medium Grid 2 Accent 4" w:uiPriority="68"/>
+    <w:lsdException w:name="Medium Grid 3 Accent 4" w:uiPriority="69"/>
+    <w:lsdException w:name="Dark List Accent 4" w:uiPriority="70"/>
+    <w:lsdException w:name="Colorful Shading Accent 4" w:uiPriority="71"/>
+    <w:lsdException w:name="Colorful List Accent 4" w:uiPriority="72"/>
+    <w:lsdException w:name="Colorful Grid Accent 4" w:uiPriority="73"/>
+    <w:lsdException w:name="Light Shading Accent 5" w:uiPriority="60"/>
+    <w:lsdException w:name="Light List Accent 5" w:uiPriority="61"/>
+    <w:lsdException w:name="Light Grid Accent 5" w:uiPriority="62"/>
+    <w:lsdException w:name="Medium Shading 1 Accent 5" w:uiPriority="63"/>
+    <w:lsdException w:name="Medium Shading 2 Accent 5" w:uiPriority="64"/>
+    <w:lsdException w:name="Medium List 1 Accent 5" w:uiPriority="65"/>
+    <w:lsdException w:name="Medium List 2 Accent 5" w:uiPriority="66"/>
+    <w:lsdException w:name="Medium Grid 1 Accent 5" w:uiPriority="67"/>
+    <w:lsdException w:name="Medium Grid 2 Accent 5" w:uiPriority="68"/>
+    <w:lsdException w:name="Medium Grid 3 Accent 5" w:uiPriority="69"/>
+    <w:lsdException w:name="Dark List Accent 5" w:uiPriority="70"/>
+    <w:lsdException w:name="Colorful Shading Accent 5" w:uiPriority="71"/>
+    <w:lsdException w:name="Colorful List Accent 5" w:uiPriority="72"/>
+    <w:lsdException w:name="Colorful Grid Accent 5" w:uiPriority="73"/>
+    <w:lsdException w:name="Light Shading Accent 6" w:uiPriority="60"/>
+    <w:lsdException w:name="Light List Accent 6" w:uiPriority="61"/>
+    <w:lsdException w:name="Light Grid Accent 6" w:uiPriority="62"/>
+    <w:lsdException w:name="Medium Shading 1 Accent 6" w:uiPriority="63"/>
+    <w:lsdException w:name="Medium Shading 2 Accent 6" w:uiPriority="64"/>
+    <w:lsdException w:name="Medium List 1 Accent 6" w:uiPriority="65"/>
+    <w:lsdException w:name="Medium List 2 Accent 6" w:uiPriority="66"/>
+    <w:lsdException w:name="Medium Grid 1 Accent 6" w:uiPriority="67"/>
+    <w:lsdException w:name="Medium Grid 2 Accent 6" w:uiPriority="68"/>
+    <w:lsdException w:name="Medium Grid 3 Accent 6" w:uiPriority="69"/>
+    <w:lsdException w:name="Dark List Accent 6" w:uiPriority="70"/>
+    <w:lsdException w:name="Colorful Shading Accent 6" w:uiPriority="71"/>
+    <w:lsdException w:name="Colorful List Accent 6" w:uiPriority="72"/>
+    <w:lsdException w:name="Colorful Grid Accent 6" w:uiPriority="73"/>
+    <w:lsdException w:name="Subtle Emphasis" w:uiPriority="19" w:qFormat="1"/>
+    <w:lsdException w:name="Intense Emphasis" w:uiPriority="21" w:qFormat="1"/>
+    <w:lsdException w:name="Subtle Reference" w:uiPriority="31" w:qFormat="1"/>
+    <w:lsdException w:name="Intense Reference" w:uiPriority="32" w:qFormat="1"/>
+    <w:lsdException w:name="Book Title" w:uiPriority="33" w:qFormat="1"/>
+    <w:lsdException w:name="Bibliography" w:semiHidden="1" w:uiPriority="37" w:unhideWhenUsed="1"/>
+    <w:lsdException w:name="TOC Heading" w:semiHidden="1" w:uiPriority="39" w:unhideWhenUsed="1" w:qFormat="1"/>
+    <w:lsdException w:name="Plain Table 1" w:uiPriority="41"/>
+    <w:lsdException w:name="Plain Table 2" w:uiPriority="42"/>
+    <w:lsdException w:name="Plain Table 3" w:uiPriority="43"/>
+    <w:lsdException w:name="Plain Table 4" w:uiPriority="44"/>
+    <w:lsdException w:name="Plain Table 5" w:uiPriority="45"/>
+    <w:lsdException w:name="Grid Table Light" w:uiPriority="40"/>
+    <w:lsdException w:name="Grid Table 1 Light" w:uiPriority="46"/>
+    <w:lsdException w:name="Grid Table 2" w:uiPriority="47"/>
+    <w:lsdException w:name="Grid Table 3" w:uiPriority="48"/>
+    <w:lsdException w:name="Grid Table 4" w:uiPriority="49"/>
+    <w:lsdException w:name="Grid Table 5 Dark" w:uiPriority="50"/>
+    <w:lsdException w:name="Grid Table 6 Colorful" w:uiPriority="51"/>
+    <w:lsdException w:name="Grid Table 7 Colorful" w:uiPriority="52"/>
+    <w:lsdException w:name="Grid Table 1 Light Accent 1" w:uiPriority="46"/>
+    <w:lsdException w:name="Grid Table 2 Accent 1" w:uiPriority="47"/>
+    <w:lsdException w:name="Grid Table 3 Accent 1" w:uiPriority="48"/>
+    <w:lsdException w:name="Grid Table 4 Accent 1" w:uiPriority="49"/>
+    <w:lsdException w:name="Grid Table 5 Dark Accent 1" w:uiPriority="50"/>
+    <w:lsdException w:name="Grid Table 6 Colorful Accent 1" w:uiPriority="51"/>
+    <w:lsdException w:name="Grid Table 7 Colorful Accent 1" w:uiPriority="52"/>
+    <w:lsdException w:name="Grid Table 1 Light Accent 2" w:uiPriority="46"/>
+    <w:lsdException w:name="Grid Table 2 Accent 2" w:uiPriority="47"/>
+    <w:lsdException w:name="Grid Table 3 Accent 2" w:uiPriority="48"/>
+    <w:lsdException w:name="Grid Table 4 Accent 2" w:uiPriority="49"/>
+    <w:lsdException w:name="Grid Table 5 Dark Accent 2" w:uiPriority="50"/>
+    <w:lsdException w:name="Grid Table 6 Colorful Accent 2" w:uiPriority="51"/>
+    <w:lsdException w:name="Grid Table 7 Colorful Accent 2" w:uiPriority="52"/>
+    <w:lsdException w:name="Grid Table 1 Light Accent 3" w:uiPriority="46"/>
+    <w:lsdException w:name="Grid Table 2 Accent 3" w:uiPriority="47"/>
+    <w:lsdException w:name="Grid Table 3 Accent 3" w:uiPriority="48"/>
+    <w:lsdException w:name="Grid Table 4 Accent 3" w:uiPriority="49"/>
+    <w:lsdException w:name="Grid Table 5 Dark Accent 3" w:uiPriority="50"/>
+    <w:lsdException w:name="Grid Table 6 Colorful Accent 3" w:uiPriority="51"/>
+    <w:lsdException w:name="Grid Table 7 Colorful Accent 3" w:uiPriority="52"/>
+    <w:lsdException w:name="Grid Table 1 Light Accent 4" w:uiPriority="46"/>
+    <w:lsdException w:name="Grid Table 2 Accent 4" w:uiPriority="47"/>
+    <w:lsdException w:name="Grid Table 3 Accent 4" w:uiPriority="48"/>
+    <w:lsdException w:name="Grid Table 4 Accent 4" w:uiPriority="49"/>
+    <w:lsdException w:name="Grid Table 5 Dark Accent 4" w:uiPriority="50"/>
+    <w:lsdException w:name="Grid Table 6 Colorful Accent 4" w:uiPriority="51"/>
+    <w:lsdException w:name="Grid Table 7 Colorful Accent 4" w:uiPriority="52"/>
+    <w:lsdException w:name="Grid Table 1 Light Accent 5" w:uiPriority="46"/>
+    <w:lsdException w:name="Grid Table 2 Accent 5" w:uiPriority="47"/>
+    <w:lsdException w:name="Grid Table 3 Accent 5" w:uiPriority="48"/>
+    <w:lsdException w:name="Grid Table 4 Accent 5" w:uiPriority="49"/>
+    <w:lsdException w:name="Grid Table 5 Dark Accent 5" w:uiPriority="50"/>
+    <w:lsdException w:name="Grid Table 6 Colorful Accent 5" w:uiPriority="51"/>
+    <w:lsdException w:name="Grid Table 7 Colorful Accent 5" w:uiPriority="52"/>
+    <w:lsdException w:name="Grid Table 1 Light Accent 6" w:uiPriority="46"/>
+    <w:lsdException w:name="Grid Table 2 Accent 6" w:uiPriority="47"/>
+    <w:lsdException w:name="Grid Table 3 Accent 6" w:uiPriority="48"/>
+    <w:lsdException w:name="Grid Table 4 Accent 6" w:uiPriority="49"/>
+    <w:lsdException w:name="Grid Table 5 Dark Accent 6" w:uiPriority="50"/>
+    <w:lsdException w:name="Grid Table 6 Colorful Accent 6" w:uiPriority="51"/>
+    <w:lsdException w:name="Grid Table 7 Colorful Accent 6" w:uiPriority="52"/>
+    <w:lsdException w:name="List Table 1 Light" w:uiPriority="46"/>
+    <w:lsdException w:name="List Table 2" w:uiPriority="47"/>
+    <w:lsdException w:name="List Table 3" w:uiPriority="48"/>
+    <w:lsdException w:name="List Table 4" w:uiPriority="49"/>
+    <w:lsdException w:name="List Table 5 Dark" w:uiPriority="50"/>
+    <w:lsdException w:name="List Table 6 Colorful" w:uiPriority="51"/>
+    <w:lsdException w:name="List Table 7 Colorful" w:uiPriority="52"/>
+    <w:lsdException w:name="List Table 1 Light Accent 1" w:uiPriority="46"/>
+    <w:lsdException w:name="List Table 2 Accent 1" w:uiPriority="47"/>
+    <w:lsdException w:name="List Table 3 Accent 1" w:uiPriority="48"/>
+    <w:lsdException w:name="List Table 4 Accent 1" w:uiPriority="49"/>
+    <w:lsdException w:name="List Table 5 Dark Accent 1" w:uiPriority="50"/>
+    <w:lsdException w:name="List Table 6 Colorful Accent 1" w:uiPriority="51"/>
+    <w:lsdException w:name="List Table 7 Colorful Accent 1" w:uiPriority="52"/>
+    <w:lsdException w:name="List Table 1 Light Accent 2" w:uiPriority="46"/>
+    <w:lsdException w:name="List Table 2 Accent 2" w:uiPriority="47"/>
+    <w:lsdException w:name="List Table 3 Accent 2" w:uiPriority="48"/>
+    <w:lsdException w:name="List Table 4 Accent 2" w:uiPriority="49"/>
+    <w:lsdException w:name="List Table 5 Dark Accent 2" w:uiPriority="50"/>
+    <w:lsdException w:name="List Table 6 Colorful Accent 2" w:uiPriority="51"/>
+    <w:lsdException w:name="List Table 7 Colorful Accent 2" w:uiPriority="52"/>
+    <w:lsdException w:name="List Table 1 Light Accent 3" w:uiPriority="46"/>
+    <w:lsdException w:name="List Table 2 Accent 3" w:uiPriority="47"/>
+    <w:lsdException w:name="List Table 3 Accent 3" w:uiPriority="48"/>
+    <w:lsdException w:name="List Table 4 Accent 3" w:uiPriority="49"/>
+    <w:lsdException w:name="List Table 5 Dark Accent 3" w:uiPriority="50"/>
+    <w:lsdException w:name="List Table 6 Colorful Accent 3" w:uiPriority="51"/>
+    <w:lsdException w:name="List Table 7 Colorful Accent 3" w:uiPriority="52"/>
+    <w:lsdException w:name="List Table 1 Light Accent 4" w:uiPriority="46"/>
+    <w:lsdException w:name="List Table 2 Accent 4" w:uiPriority="47"/>
+    <w:lsdException w:name="List Table 3 Accent 4" w:uiPriority="48"/>
+    <w:lsdException w:name="List Table 4 Accent 4" w:uiPriority="49"/>
+    <w:lsdException w:name="List Table 5 Dark Accent 4" w:uiPriority="50"/>
+    <w:lsdException w:name="List Table 6 Colorful Accent 4" w:uiPriority="51"/>
+    <w:lsdException w:name="List Table 7 Colorful Accent 4" w:uiPriority="52"/>
+    <w:lsdException w:name="List Table 1 Light Accent 5" w:uiPriority="46"/>
+    <w:lsdException w:name="List Table 2 Accent 5" w:uiPriority="47"/>
+    <w:lsdException w:name="List Table 3 Accent 5" w:uiPriority="48"/>
+    <w:lsdException w:name="List Table 4 Accent 5" w:uiPriority="49"/>
+    <w:lsdException w:name="List Table 5 Dark Accent 5" w:uiPriority="50"/>
+    <w:lsdException w:name="List Table 6 Colorful Accent 5" w:uiPriority="51"/>
+    <w:lsdException w:name="List Table 7 Colorful Accent 5" w:uiPriority="52"/>
+    <w:lsdException w:name="List Table 1 Light Accent 6" w:uiPriority="46"/>
+    <w:lsdException w:name="List Table 2 Accent 6" w:uiPriority="47"/>
+    <w:lsdException w:name="List Table 3 Accent 6" w:uiPriority="48"/>
+    <w:lsdException w:name="List Table 4 Accent 6" w:uiPriority="49"/>
+    <w:lsdException w:name="List Table 5 Dark Accent 6" w:uiPriority="50"/>
+    <w:lsdException w:name="List Table 6 Colorful Accent 6" w:uiPriority="51"/>
+    <w:lsdException w:name="List Table 7 Colorful Accent 6" w:uiPriority="52"/>
+    <w:lsdException w:name="Mention" w:semiHidden="1" w:unhideWhenUsed="1"/>
+    <w:lsdException w:name="Smart Hyperlink" w:semiHidden="1" w:unhideWhenUsed="1"/>
+    <w:lsdException w:name="Hashtag" w:semiHidden="1" w:unhideWhenUsed="1"/>
+    <w:lsdException w:name="Unresolved Mention" w:semiHidden="1" w:unhideWhenUsed="1"/>
+    <w:lsdException w:name="Smart Link" w:semiHidden="1" w:unhideWhenUsed="1"/>
+  </w:latentStyles>
+  <w:style w:type="paragraph" w:default="1" w:styleId="Normal">
+    <w:name w:val="Normal"/>
+    <w:qFormat/>
   </w:style>
   <w:style w:type="paragraph" w:styleId="Heading1">
     <w:name w:val="heading 1"/>
     <w:basedOn w:val="Normal"/>
     <w:next w:val="Normal"/>
+    <w:uiPriority w:val="9"/>
+    <w:qFormat/>
     <w:pPr>
-      <w:keepNext w:val="1"/>
-      <w:keepLines w:val="1"/>
-      <w:pageBreakBefore w:val="0"/>
-      <w:spacing w:after="120" w:before="400" w:lineRule="auto"/>
+      <w:keepNext/>
+      <w:keepLines/>
+      <w:spacing w:before="400" w:after="120"/>
+      <w:outlineLvl w:val="0"/>
     </w:pPr>
     <w:rPr>
       <w:sz w:val="40"/>
@@ -604,14 +978,17 @@
     <w:name w:val="heading 2"/>
     <w:basedOn w:val="Normal"/>
     <w:next w:val="Normal"/>
+    <w:uiPriority w:val="9"/>
+    <w:semiHidden/>
+    <w:unhideWhenUsed/>
+    <w:qFormat/>
     <w:pPr>
-      <w:keepNext w:val="1"/>
-      <w:keepLines w:val="1"/>
-      <w:pageBreakBefore w:val="0"/>
-      <w:spacing w:after="120" w:before="360" w:lineRule="auto"/>
+      <w:keepNext/>
+      <w:keepLines/>
+      <w:spacing w:before="360" w:after="120"/>
+      <w:outlineLvl w:val="1"/>
     </w:pPr>
     <w:rPr>
-      <w:b w:val="0"/>
       <w:sz w:val="32"/>
       <w:szCs w:val="32"/>
     </w:rPr>
@@ -620,14 +997,17 @@
     <w:name w:val="heading 3"/>
     <w:basedOn w:val="Normal"/>
     <w:next w:val="Normal"/>
+    <w:uiPriority w:val="9"/>
+    <w:semiHidden/>
+    <w:unhideWhenUsed/>
+    <w:qFormat/>
     <w:pPr>
-      <w:keepNext w:val="1"/>
-      <w:keepLines w:val="1"/>
-      <w:pageBreakBefore w:val="0"/>
-      <w:spacing w:after="80" w:before="320" w:lineRule="auto"/>
+      <w:keepNext/>
+      <w:keepLines/>
+      <w:spacing w:before="320" w:after="80"/>
+      <w:outlineLvl w:val="2"/>
     </w:pPr>
     <w:rPr>
-      <w:b w:val="0"/>
       <w:color w:val="434343"/>
       <w:sz w:val="28"/>
       <w:szCs w:val="28"/>
@@ -637,11 +1017,15 @@
     <w:name w:val="heading 4"/>
     <w:basedOn w:val="Normal"/>
     <w:next w:val="Normal"/>
+    <w:uiPriority w:val="9"/>
+    <w:semiHidden/>
+    <w:unhideWhenUsed/>
+    <w:qFormat/>
     <w:pPr>
-      <w:keepNext w:val="1"/>
-      <w:keepLines w:val="1"/>
-      <w:pageBreakBefore w:val="0"/>
-      <w:spacing w:after="80" w:before="280" w:lineRule="auto"/>
+      <w:keepNext/>
+      <w:keepLines/>
+      <w:spacing w:before="280" w:after="80"/>
+      <w:outlineLvl w:val="3"/>
     </w:pPr>
     <w:rPr>
       <w:color w:val="666666"/>
@@ -653,105 +1037,164 @@
     <w:name w:val="heading 5"/>
     <w:basedOn w:val="Normal"/>
     <w:next w:val="Normal"/>
+    <w:uiPriority w:val="9"/>
+    <w:semiHidden/>
+    <w:unhideWhenUsed/>
+    <w:qFormat/>
     <w:pPr>
-      <w:keepNext w:val="1"/>
-      <w:keepLines w:val="1"/>
-      <w:pageBreakBefore w:val="0"/>
-      <w:spacing w:after="80" w:before="240" w:lineRule="auto"/>
+      <w:keepNext/>
+      <w:keepLines/>
+      <w:spacing w:before="240" w:after="80"/>
+      <w:outlineLvl w:val="4"/>
     </w:pPr>
     <w:rPr>
       <w:color w:val="666666"/>
-      <w:sz w:val="22"/>
-      <w:szCs w:val="22"/>
     </w:rPr>
   </w:style>
   <w:style w:type="paragraph" w:styleId="Heading6">
     <w:name w:val="heading 6"/>
     <w:basedOn w:val="Normal"/>
     <w:next w:val="Normal"/>
+    <w:uiPriority w:val="9"/>
+    <w:semiHidden/>
+    <w:unhideWhenUsed/>
+    <w:qFormat/>
     <w:pPr>
-      <w:keepNext w:val="1"/>
-      <w:keepLines w:val="1"/>
-      <w:pageBreakBefore w:val="0"/>
-      <w:spacing w:after="80" w:before="240" w:lineRule="auto"/>
+      <w:keepNext/>
+      <w:keepLines/>
+      <w:spacing w:before="240" w:after="80"/>
+      <w:outlineLvl w:val="5"/>
     </w:pPr>
     <w:rPr>
-      <w:i w:val="1"/>
+      <w:i/>
       <w:color w:val="666666"/>
-      <w:sz w:val="22"/>
-      <w:szCs w:val="22"/>
     </w:rPr>
+  </w:style>
+  <w:style w:type="character" w:default="1" w:styleId="DefaultParagraphFont">
+    <w:name w:val="Default Paragraph Font"/>
+    <w:uiPriority w:val="1"/>
+    <w:semiHidden/>
+    <w:unhideWhenUsed/>
+  </w:style>
+  <w:style w:type="table" w:default="1" w:styleId="TableNormal">
+    <w:name w:val="Normal Table"/>
+    <w:uiPriority w:val="99"/>
+    <w:semiHidden/>
+    <w:unhideWhenUsed/>
+    <w:tblPr>
+      <w:tblInd w:w="0" w:type="dxa"/>
+      <w:tblCellMar>
+        <w:top w:w="0" w:type="dxa"/>
+        <w:left w:w="108" w:type="dxa"/>
+        <w:bottom w:w="0" w:type="dxa"/>
+        <w:right w:w="108" w:type="dxa"/>
+      </w:tblCellMar>
+    </w:tblPr>
+  </w:style>
+  <w:style w:type="numbering" w:default="1" w:styleId="NoList">
+    <w:name w:val="No List"/>
+    <w:uiPriority w:val="99"/>
+    <w:semiHidden/>
+    <w:unhideWhenUsed/>
+  </w:style>
+  <w:style w:type="table" w:customStyle="1" w:styleId="TableNormal0">
+    <w:name w:val="TableNormal"/>
+    <w:tblPr>
+      <w:tblCellMar>
+        <w:top w:w="100" w:type="dxa"/>
+        <w:left w:w="100" w:type="dxa"/>
+        <w:bottom w:w="100" w:type="dxa"/>
+        <w:right w:w="100" w:type="dxa"/>
+      </w:tblCellMar>
+    </w:tblPr>
   </w:style>
   <w:style w:type="paragraph" w:styleId="Title">
     <w:name w:val="Title"/>
     <w:basedOn w:val="Normal"/>
     <w:next w:val="Normal"/>
+    <w:uiPriority w:val="10"/>
+    <w:qFormat/>
     <w:pPr>
-      <w:keepNext w:val="1"/>
-      <w:keepLines w:val="1"/>
-      <w:pageBreakBefore w:val="0"/>
-      <w:spacing w:after="60" w:before="0" w:lineRule="auto"/>
+      <w:keepNext/>
+      <w:keepLines/>
+      <w:spacing w:after="60"/>
     </w:pPr>
     <w:rPr>
       <w:sz w:val="52"/>
       <w:szCs w:val="52"/>
     </w:rPr>
   </w:style>
-  <w:style w:type="paragraph" w:styleId="Normal" w:default="1">
-    <w:name w:val="normal"/>
-  </w:style>
-  <w:style w:type="table" w:styleId="TableNormal" w:default="1">
-    <w:name w:val="Table Normal"/>
-  </w:style>
-  <w:style w:type="table" w:styleId="Table1">
+  <w:style w:type="table" w:customStyle="1" w:styleId="a">
     <w:basedOn w:val="TableNormal"/>
     <w:pPr>
-      <w:spacing w:after="0" w:line="240" w:lineRule="auto"/>
+      <w:spacing w:line="240" w:lineRule="auto"/>
     </w:pPr>
     <w:tblPr>
       <w:tblStyleRowBandSize w:val="1"/>
       <w:tblStyleColBandSize w:val="1"/>
-      <w:tblCellMar>
-        <w:top w:w="0.0" w:type="dxa"/>
-        <w:left w:w="108.0" w:type="dxa"/>
-        <w:bottom w:w="0.0" w:type="dxa"/>
-        <w:right w:w="108.0" w:type="dxa"/>
-      </w:tblCellMar>
     </w:tblPr>
   </w:style>
   <w:style w:type="paragraph" w:styleId="Subtitle">
     <w:name w:val="Subtitle"/>
     <w:basedOn w:val="Normal"/>
     <w:next w:val="Normal"/>
+    <w:uiPriority w:val="11"/>
+    <w:qFormat/>
     <w:pPr>
-      <w:keepNext w:val="1"/>
-      <w:keepLines w:val="1"/>
-      <w:pageBreakBefore w:val="0"/>
-      <w:spacing w:after="320" w:before="0" w:lineRule="auto"/>
+      <w:keepNext/>
+      <w:keepLines/>
+      <w:spacing w:after="320"/>
     </w:pPr>
     <w:rPr>
-      <w:rFonts w:ascii="Arial" w:cs="Arial" w:eastAsia="Arial" w:hAnsi="Arial"/>
-      <w:i w:val="0"/>
       <w:color w:val="666666"/>
       <w:sz w:val="30"/>
       <w:szCs w:val="30"/>
     </w:rPr>
   </w:style>
-  <w:style w:type="table" w:styleId="Table1">
+  <w:style w:type="table" w:customStyle="1" w:styleId="a0">
     <w:basedOn w:val="TableNormal"/>
     <w:pPr>
-      <w:spacing w:after="0" w:line="240" w:lineRule="auto"/>
+      <w:spacing w:line="240" w:lineRule="auto"/>
     </w:pPr>
     <w:tblPr>
       <w:tblStyleRowBandSize w:val="1"/>
       <w:tblStyleColBandSize w:val="1"/>
-      <w:tblCellMar>
-        <w:top w:w="0.0" w:type="dxa"/>
-        <w:left w:w="108.0" w:type="dxa"/>
-        <w:bottom w:w="0.0" w:type="dxa"/>
-        <w:right w:w="108.0" w:type="dxa"/>
-      </w:tblCellMar>
     </w:tblPr>
+  </w:style>
+  <w:style w:type="character" w:styleId="Hyperlink">
+    <w:name w:val="Hyperlink"/>
+    <w:basedOn w:val="DefaultParagraphFont"/>
+    <w:uiPriority w:val="99"/>
+    <w:unhideWhenUsed/>
+    <w:rsid w:val="001255C9"/>
+    <w:rPr>
+      <w:color w:val="0000FF" w:themeColor="hyperlink"/>
+      <w:u w:val="single"/>
+    </w:rPr>
+  </w:style>
+  <w:style w:type="character" w:styleId="UnresolvedMention">
+    <w:name w:val="Unresolved Mention"/>
+    <w:basedOn w:val="DefaultParagraphFont"/>
+    <w:uiPriority w:val="99"/>
+    <w:semiHidden/>
+    <w:unhideWhenUsed/>
+    <w:rsid w:val="001255C9"/>
+    <w:rPr>
+      <w:color w:val="605E5C"/>
+      <w:shd w:val="clear" w:color="auto" w:fill="E1DFDD"/>
+    </w:rPr>
+  </w:style>
+  <w:style w:type="character" w:styleId="FollowedHyperlink">
+    <w:name w:val="FollowedHyperlink"/>
+    <w:basedOn w:val="DefaultParagraphFont"/>
+    <w:uiPriority w:val="99"/>
+    <w:semiHidden/>
+    <w:unhideWhenUsed/>
+    <w:rsid w:val="001255C9"/>
+    <w:rPr>
+      <w:color w:val="800080" w:themeColor="followedHyperlink"/>
+      <w:u w:val="single"/>
+    </w:rPr>
   </w:style>
 </w:styles>
 </file>
@@ -1076,17 +1519,17 @@
 </a:theme>
 </file>
 
-<file path=customXML/item1.xml><?xml version="1.0" encoding="utf-8"?>
+<file path=customXml/item1.xml><?xml version="1.0" encoding="utf-8"?>
 <go:gDocsCustomXmlDataStorage xmlns:go="http://customooxmlschemas.google.com/" xmlns:r="http://schemas.openxmlformats.org/officeDocument/2006/relationships" uri="GoogleDocsCustomDataVersion2">
   <go:docsCustomData xmlns:go="http://customooxmlschemas.google.com/" roundtripDataSignature="AMtx7mhUlv+TO4gsFMS39EGMPNnynAmCSg==">CgMxLjA4AHIhMWE4cXEwS05jXzluWGNRVlpIZ1dWZDk0eVNNMjM3Y044</go:docsCustomData>
 </go:gDocsCustomXmlDataStorage>
 </file>
 
-<file path=customXML/itemProps1.xml><?xml version="1.0" encoding="utf-8"?>
+<file path=customXml/itemProps1.xml><?xml version="1.0" encoding="utf-8"?>
 <ds:datastoreItem xmlns:ds="http://schemas.openxmlformats.org/officeDocument/2006/customXml" ds:itemID="{11111111-1234-1234-1234-123412341234}">
   <ds:schemaRefs>
+    <ds:schemaRef ds:uri="http://customooxmlschemas.google.com/"/>
     <ds:schemaRef ds:uri="http://schemas.openxmlformats.org/officeDocument/2006/relationships"/>
-    <ds:schemaRef ds:uri="http://customooxmlschemas.google.com/"/>
   </ds:schemaRefs>
 </ds:datastoreItem>
 </file>
</xml_diff>